<commit_message>
i have the results
</commit_message>
<xml_diff>
--- a/Final_Project_Ideas.docx
+++ b/Final_Project_Ideas.docx
@@ -112,7 +112,23 @@
           <w:b/>
           <w:bCs/>
         </w:rPr>
-        <w:t>clean, finishable, and gradable</w:t>
+        <w:t xml:space="preserve">clean, </w:t>
+      </w:r>
+      <w:proofErr w:type="spellStart"/>
+      <w:r>
+        <w:rPr>
+          <w:b/>
+          <w:bCs/>
+        </w:rPr>
+        <w:t>finishable</w:t>
+      </w:r>
+      <w:proofErr w:type="spellEnd"/>
+      <w:r>
+        <w:rPr>
+          <w:b/>
+          <w:bCs/>
+        </w:rPr>
+        <w:t>, and gradable</w:t>
       </w:r>
       <w:r>
         <w:t xml:space="preserve"> by April 20.</w:t>
@@ -480,6 +496,7 @@
                 <w:bCs/>
               </w:rPr>
             </w:pPr>
+            <w:proofErr w:type="spellStart"/>
             <w:r>
               <w:rPr>
                 <w:b/>
@@ -487,6 +504,7 @@
               </w:rPr>
               <w:t>StudentTeacherRatio</w:t>
             </w:r>
+            <w:proofErr w:type="spellEnd"/>
           </w:p>
         </w:tc>
         <w:tc>
@@ -502,6 +520,7 @@
                 <w:bCs/>
               </w:rPr>
             </w:pPr>
+            <w:proofErr w:type="spellStart"/>
             <w:r>
               <w:rPr>
                 <w:b/>
@@ -509,6 +528,7 @@
               </w:rPr>
               <w:t>MedianIncome</w:t>
             </w:r>
+            <w:proofErr w:type="spellEnd"/>
           </w:p>
         </w:tc>
         <w:tc>
@@ -524,6 +544,7 @@
                 <w:bCs/>
               </w:rPr>
             </w:pPr>
+            <w:proofErr w:type="spellStart"/>
             <w:r>
               <w:rPr>
                 <w:b/>
@@ -531,6 +552,7 @@
               </w:rPr>
               <w:t>PovertyRate</w:t>
             </w:r>
+            <w:proofErr w:type="spellEnd"/>
           </w:p>
         </w:tc>
         <w:tc>
@@ -677,8 +699,13 @@
           <w:numId w:val="4"/>
         </w:numPr>
       </w:pPr>
-      <w:r>
-        <w:t>XGBoost / Gradient Boosting (if allowed)</w:t>
+      <w:proofErr w:type="spellStart"/>
+      <w:r>
+        <w:t>XGBoost</w:t>
+      </w:r>
+      <w:proofErr w:type="spellEnd"/>
+      <w:r>
+        <w:t xml:space="preserve"> / Gradient Boosting (if allowed)</w:t>
       </w:r>
     </w:p>
     <w:p>
@@ -1010,8 +1037,13 @@
           <w:numId w:val="9"/>
         </w:numPr>
       </w:pPr>
-      <w:r>
-        <w:t>Evaluate + compare</w:t>
+      <w:proofErr w:type="gramStart"/>
+      <w:r>
+        <w:t>Evaluate</w:t>
+      </w:r>
+      <w:proofErr w:type="gramEnd"/>
+      <w:r>
+        <w:t xml:space="preserve"> + compare</w:t>
       </w:r>
     </w:p>
     <w:p>
@@ -1041,8 +1073,13 @@
           <w:numId w:val="10"/>
         </w:numPr>
       </w:pPr>
-      <w:r>
-        <w:t>Feature importance</w:t>
+      <w:proofErr w:type="gramStart"/>
+      <w:r>
+        <w:t>Feature</w:t>
+      </w:r>
+      <w:proofErr w:type="gramEnd"/>
+      <w:r>
+        <w:t xml:space="preserve"> importance</w:t>
       </w:r>
     </w:p>
     <w:p>
@@ -1240,7 +1277,15 @@
     </w:p>
     <w:p>
       <w:r>
-        <w:t xml:space="preserve">That’s actually a </w:t>
+        <w:t xml:space="preserve">That’s </w:t>
+      </w:r>
+      <w:proofErr w:type="gramStart"/>
+      <w:r>
+        <w:t>actually a</w:t>
+      </w:r>
+      <w:proofErr w:type="gramEnd"/>
+      <w:r>
+        <w:t xml:space="preserve"> </w:t>
       </w:r>
       <w:r>
         <w:rPr>
@@ -1458,11 +1503,19 @@
         <w:t>Average NAEP reading/math scores by state.</w:t>
       </w:r>
       <w:hyperlink r:id="rId5" w:tgtFrame="_blank" w:history="1">
+        <w:proofErr w:type="gramStart"/>
         <w:r>
           <w:rPr>
             <w:rStyle w:val="Hyperlink"/>
           </w:rPr>
-          <w:t>nces.ed+2</w:t>
+          <w:t>nces.ed</w:t>
+        </w:r>
+        <w:proofErr w:type="gramEnd"/>
+        <w:r>
+          <w:rPr>
+            <w:rStyle w:val="Hyperlink"/>
+          </w:rPr>
+          <w:t>+2</w:t>
         </w:r>
       </w:hyperlink>
     </w:p>
@@ -1504,36 +1557,74 @@
         </w:numPr>
       </w:pPr>
       <w:r>
-        <w:t>Socioeconomic: poverty rate, median income, racial/ethnic composition, urbanization, etc., from Census/ACS-like sources.[</w:t>
-      </w:r>
-      <w:hyperlink r:id="rId7" w:history="1">
+        <w:t xml:space="preserve">Socioeconomic: poverty rate, median income, racial/ethnic composition, urbanization, etc., from Census/ACS-like </w:t>
+      </w:r>
+      <w:proofErr w:type="gramStart"/>
+      <w:r>
+        <w:t>sources.[</w:t>
+      </w:r>
+      <w:proofErr w:type="spellStart"/>
+      <w:proofErr w:type="gramEnd"/>
+      <w:r>
+        <w:fldChar w:fldCharType="begin"/>
+      </w:r>
+      <w:r>
+        <w:instrText>HYPERLINK "https://apps.urban.org/features/naep/"</w:instrText>
+      </w:r>
+      <w:r>
+        <w:fldChar w:fldCharType="separate"/>
+      </w:r>
+      <w:proofErr w:type="gramStart"/>
+      <w:r>
+        <w:rPr>
+          <w:rStyle w:val="Hyperlink"/>
+        </w:rPr>
+        <w:t>apps.urban</w:t>
+      </w:r>
+      <w:proofErr w:type="spellEnd"/>
+      <w:proofErr w:type="gramEnd"/>
+      <w:r>
+        <w:fldChar w:fldCharType="end"/>
+      </w:r>
+      <w:r>
+        <w:t>]</w:t>
+      </w:r>
+      <w:r>
+        <w:rPr>
+          <w:rFonts w:ascii="Arial" w:hAnsi="Arial" w:cs="Arial"/>
+        </w:rPr>
+        <w:t>​</w:t>
+      </w:r>
+    </w:p>
+    <w:p>
+      <w:pPr>
+        <w:numPr>
+          <w:ilvl w:val="1"/>
+          <w:numId w:val="15"/>
+        </w:numPr>
+      </w:pPr>
+      <w:r>
+        <w:t>Why this is good for you:</w:t>
+      </w:r>
+    </w:p>
+    <w:p>
+      <w:pPr>
+        <w:numPr>
+          <w:ilvl w:val="2"/>
+          <w:numId w:val="15"/>
+        </w:numPr>
+      </w:pPr>
+      <w:r>
+        <w:t>Clear ML framing (regression with numeric target) and straightforward metrics (R², MAE).</w:t>
+      </w:r>
+      <w:hyperlink r:id="rId7" w:tgtFrame="_blank" w:history="1">
         <w:r>
           <w:rPr>
             <w:rStyle w:val="Hyperlink"/>
           </w:rPr>
-          <w:t>apps.urban</w:t>
+          <w:t>nces.ed+1</w:t>
         </w:r>
       </w:hyperlink>
-      <w:r>
-        <w:t>]</w:t>
-      </w:r>
-      <w:r>
-        <w:rPr>
-          <w:rFonts w:ascii="Arial" w:hAnsi="Arial" w:cs="Arial"/>
-        </w:rPr>
-        <w:t>​</w:t>
-      </w:r>
-    </w:p>
-    <w:p>
-      <w:pPr>
-        <w:numPr>
-          <w:ilvl w:val="1"/>
-          <w:numId w:val="15"/>
-        </w:numPr>
-      </w:pPr>
-      <w:r>
-        <w:t>Why this is good for you:</w:t>
-      </w:r>
     </w:p>
     <w:p>
       <w:pPr>
@@ -1543,7 +1634,7 @@
         </w:numPr>
       </w:pPr>
       <w:r>
-        <w:t>Clear ML framing (regression with numeric target) and straightforward metrics (R², MAE).</w:t>
+        <w:t>State-level data is wide (many features) but not huge (50 states × years), so you can focus on modeling + interpretation rather than large-scale engineering.</w:t>
       </w:r>
       <w:hyperlink r:id="rId8" w:tgtFrame="_blank" w:history="1">
         <w:r>
@@ -1562,9 +1653,379 @@
         </w:numPr>
       </w:pPr>
       <w:r>
-        <w:t>State-level data is wide (many features) but not huge (50 states × years), so you can focus on modeling + interpretation rather than large-scale engineering.</w:t>
+        <w:t xml:space="preserve">There is policy-relevant context around demographic-adjusted scores, especially with NAEP data and adjusted </w:t>
+      </w:r>
+      <w:proofErr w:type="gramStart"/>
+      <w:r>
+        <w:t>comparisons.[</w:t>
+      </w:r>
+      <w:proofErr w:type="spellStart"/>
+      <w:proofErr w:type="gramEnd"/>
+      <w:r>
+        <w:fldChar w:fldCharType="begin"/>
+      </w:r>
+      <w:r>
+        <w:instrText>HYPERLINK "https://apps.urban.org/features/naep/"</w:instrText>
+      </w:r>
+      <w:r>
+        <w:fldChar w:fldCharType="separate"/>
+      </w:r>
+      <w:proofErr w:type="gramStart"/>
+      <w:r>
+        <w:rPr>
+          <w:rStyle w:val="Hyperlink"/>
+        </w:rPr>
+        <w:t>apps.urban</w:t>
+      </w:r>
+      <w:proofErr w:type="spellEnd"/>
+      <w:proofErr w:type="gramEnd"/>
+      <w:r>
+        <w:fldChar w:fldCharType="end"/>
+      </w:r>
+      <w:r>
+        <w:t>]</w:t>
+      </w:r>
+      <w:r>
+        <w:rPr>
+          <w:rFonts w:ascii="Arial" w:hAnsi="Arial" w:cs="Arial"/>
+        </w:rPr>
+        <w:t>​</w:t>
+      </w:r>
+    </w:p>
+    <w:p>
+      <w:pPr>
+        <w:numPr>
+          <w:ilvl w:val="0"/>
+          <w:numId w:val="15"/>
+        </w:numPr>
+      </w:pPr>
+      <w:r>
+        <w:rPr>
+          <w:b/>
+          <w:bCs/>
+        </w:rPr>
+        <w:t>Optional extension: Cluster states into “education profiles”</w:t>
+      </w:r>
+    </w:p>
+    <w:p>
+      <w:pPr>
+        <w:numPr>
+          <w:ilvl w:val="1"/>
+          <w:numId w:val="15"/>
+        </w:numPr>
+      </w:pPr>
+      <w:r>
+        <w:lastRenderedPageBreak/>
+        <w:t>After training the regression model, reuse your standardized feature set (or model outputs) and apply clustering (e.g., K</w:t>
+      </w:r>
+      <w:r>
+        <w:noBreakHyphen/>
+        <w:t>means) to group states with similar education and socioeconomic patterns.</w:t>
       </w:r>
       <w:hyperlink r:id="rId9" w:tgtFrame="_blank" w:history="1">
+        <w:r>
+          <w:rPr>
+            <w:rStyle w:val="Hyperlink"/>
+          </w:rPr>
+          <w:t>pmc.ncbi.nlm.nih+1</w:t>
+        </w:r>
+      </w:hyperlink>
+    </w:p>
+    <w:p>
+      <w:pPr>
+        <w:numPr>
+          <w:ilvl w:val="1"/>
+          <w:numId w:val="15"/>
+        </w:numPr>
+      </w:pPr>
+      <w:r>
+        <w:t xml:space="preserve">You can then interpret clusters as “high outcome, low spending,” “low outcome, high disadvantage,” etc., but frame them carefully as </w:t>
+      </w:r>
+      <w:r>
+        <w:rPr>
+          <w:b/>
+          <w:bCs/>
+        </w:rPr>
+        <w:t>profiles</w:t>
+      </w:r>
+      <w:r>
+        <w:t>, not absolute “best/worst” rankings.</w:t>
+      </w:r>
+      <w:hyperlink r:id="rId10" w:tgtFrame="_blank" w:history="1">
+        <w:r>
+          <w:rPr>
+            <w:rStyle w:val="Hyperlink"/>
+          </w:rPr>
+          <w:t>pmc.ncbi.nlm.nih+1</w:t>
+        </w:r>
+      </w:hyperlink>
+    </w:p>
+    <w:p>
+      <w:pPr>
+        <w:numPr>
+          <w:ilvl w:val="1"/>
+          <w:numId w:val="15"/>
+        </w:numPr>
+      </w:pPr>
+      <w:r>
+        <w:t>You’ll have good material to discuss clustering pipeline and metrics like silhouette score or Davies–Bouldin index.[</w:t>
+      </w:r>
+      <w:proofErr w:type="spellStart"/>
+      <w:r>
+        <w:fldChar w:fldCharType="begin"/>
+      </w:r>
+      <w:r>
+        <w:instrText>HYPERLINK "https://www.geeksforgeeks.org/machine-learning/clustering-metrics/"</w:instrText>
+      </w:r>
+      <w:r>
+        <w:fldChar w:fldCharType="separate"/>
+      </w:r>
+      <w:r>
+        <w:rPr>
+          <w:rStyle w:val="Hyperlink"/>
+        </w:rPr>
+        <w:t>geeksforgeeks</w:t>
+      </w:r>
+      <w:proofErr w:type="spellEnd"/>
+      <w:r>
+        <w:fldChar w:fldCharType="end"/>
+      </w:r>
+      <w:r>
+        <w:t>]</w:t>
+      </w:r>
+      <w:r>
+        <w:rPr>
+          <w:rFonts w:ascii="Arial" w:hAnsi="Arial" w:cs="Arial"/>
+        </w:rPr>
+        <w:t>​</w:t>
+      </w:r>
+    </w:p>
+    <w:p>
+      <w:r>
+        <w:t>Trying to build a single “Education Quality Index” that claims to rank states definitively is doable but risky, because:</w:t>
+      </w:r>
+    </w:p>
+    <w:p>
+      <w:pPr>
+        <w:numPr>
+          <w:ilvl w:val="0"/>
+          <w:numId w:val="16"/>
+        </w:numPr>
+      </w:pPr>
+      <w:r>
+        <w:t>You must choose weights and indicators, which can be somewhat arbitrary without a strong policy framework like NAEP-adjusted scores or expert guidelines.</w:t>
+      </w:r>
+      <w:hyperlink r:id="rId11" w:tgtFrame="_blank" w:history="1">
+        <w:r>
+          <w:rPr>
+            <w:rStyle w:val="Hyperlink"/>
+          </w:rPr>
+          <w:t>urban+1</w:t>
+        </w:r>
+      </w:hyperlink>
+    </w:p>
+    <w:p>
+      <w:pPr>
+        <w:numPr>
+          <w:ilvl w:val="0"/>
+          <w:numId w:val="16"/>
+        </w:numPr>
+      </w:pPr>
+      <w:r>
+        <w:t xml:space="preserve">Interpretation can be contentious, and you’ll spend time defending the index instead of showcasing ML </w:t>
+      </w:r>
+      <w:proofErr w:type="gramStart"/>
+      <w:r>
+        <w:t>techniques.[</w:t>
+      </w:r>
+      <w:proofErr w:type="spellStart"/>
+      <w:proofErr w:type="gramEnd"/>
+      <w:r>
+        <w:fldChar w:fldCharType="begin"/>
+      </w:r>
+      <w:r>
+        <w:instrText>HYPERLINK "https://apps.urban.org/features/naep/"</w:instrText>
+      </w:r>
+      <w:r>
+        <w:fldChar w:fldCharType="separate"/>
+      </w:r>
+      <w:proofErr w:type="gramStart"/>
+      <w:r>
+        <w:rPr>
+          <w:rStyle w:val="Hyperlink"/>
+        </w:rPr>
+        <w:t>apps.urban</w:t>
+      </w:r>
+      <w:proofErr w:type="spellEnd"/>
+      <w:proofErr w:type="gramEnd"/>
+      <w:r>
+        <w:fldChar w:fldCharType="end"/>
+      </w:r>
+      <w:r>
+        <w:t>]</w:t>
+      </w:r>
+      <w:r>
+        <w:rPr>
+          <w:rFonts w:ascii="Arial" w:hAnsi="Arial" w:cs="Arial"/>
+        </w:rPr>
+        <w:t>​</w:t>
+      </w:r>
+    </w:p>
+    <w:p>
+      <w:proofErr w:type="gramStart"/>
+      <w:r>
+        <w:t>So</w:t>
+      </w:r>
+      <w:proofErr w:type="gramEnd"/>
+      <w:r>
+        <w:t xml:space="preserve"> I would frame your project as:</w:t>
+      </w:r>
+    </w:p>
+    <w:p>
+      <w:r>
+        <w:t>“Predicting state-level education outcomes from socioeconomic and policy features, with clustering-based profiles of state education systems (not a hard ranking).”</w:t>
+      </w:r>
+    </w:p>
+    <w:p>
+      <w:pPr>
+        <w:rPr>
+          <w:b/>
+          <w:bCs/>
+        </w:rPr>
+      </w:pPr>
+      <w:r>
+        <w:rPr>
+          <w:b/>
+          <w:bCs/>
+        </w:rPr>
+        <w:t>Data sources and structure (concrete plan)</w:t>
+      </w:r>
+    </w:p>
+    <w:p>
+      <w:r>
+        <w:t>Here is a realistic data backbone you can assemble:</w:t>
+      </w:r>
+    </w:p>
+    <w:p>
+      <w:pPr>
+        <w:numPr>
+          <w:ilvl w:val="0"/>
+          <w:numId w:val="17"/>
+        </w:numPr>
+      </w:pPr>
+      <w:r>
+        <w:rPr>
+          <w:b/>
+          <w:bCs/>
+        </w:rPr>
+        <w:t>Outcome variable</w:t>
+      </w:r>
+    </w:p>
+    <w:p>
+      <w:pPr>
+        <w:numPr>
+          <w:ilvl w:val="1"/>
+          <w:numId w:val="17"/>
+        </w:numPr>
+      </w:pPr>
+      <w:r>
+        <w:t xml:space="preserve">State-level </w:t>
+      </w:r>
+      <w:r>
+        <w:rPr>
+          <w:b/>
+          <w:bCs/>
+        </w:rPr>
+        <w:t>graduation rates</w:t>
+      </w:r>
+      <w:r>
+        <w:t>: NCES “Adjusted Cohort Graduation Rate (ACGR)” by state, public high school, over multiple years.[</w:t>
+      </w:r>
+      <w:proofErr w:type="spellStart"/>
+      <w:r>
+        <w:fldChar w:fldCharType="begin"/>
+      </w:r>
+      <w:r>
+        <w:instrText>HYPERLINK "https://nces.ed.gov/programs/coe/indicator/coi/high-school-graduation-rates"</w:instrText>
+      </w:r>
+      <w:r>
+        <w:fldChar w:fldCharType="separate"/>
+      </w:r>
+      <w:r>
+        <w:rPr>
+          <w:rStyle w:val="Hyperlink"/>
+        </w:rPr>
+        <w:t>nces.ed</w:t>
+      </w:r>
+      <w:proofErr w:type="spellEnd"/>
+      <w:r>
+        <w:fldChar w:fldCharType="end"/>
+      </w:r>
+      <w:r>
+        <w:t>]</w:t>
+      </w:r>
+      <w:r>
+        <w:rPr>
+          <w:rFonts w:ascii="Arial" w:hAnsi="Arial" w:cs="Arial"/>
+        </w:rPr>
+        <w:t>​</w:t>
+      </w:r>
+    </w:p>
+    <w:p>
+      <w:pPr>
+        <w:numPr>
+          <w:ilvl w:val="1"/>
+          <w:numId w:val="17"/>
+        </w:numPr>
+      </w:pPr>
+      <w:r>
+        <w:t xml:space="preserve">OR state-level </w:t>
+      </w:r>
+      <w:r>
+        <w:rPr>
+          <w:b/>
+          <w:bCs/>
+        </w:rPr>
+        <w:t>NAEP scores</w:t>
+      </w:r>
+      <w:r>
+        <w:t xml:space="preserve"> (math/reading, grade 4 or 8) for consistent, standardized test outcomes by state and year.</w:t>
+      </w:r>
+      <w:hyperlink r:id="rId12" w:tgtFrame="_blank" w:history="1">
+        <w:r>
+          <w:rPr>
+            <w:rStyle w:val="Hyperlink"/>
+          </w:rPr>
+          <w:t>nationsreportcard+1</w:t>
+        </w:r>
+      </w:hyperlink>
+    </w:p>
+    <w:p>
+      <w:pPr>
+        <w:numPr>
+          <w:ilvl w:val="0"/>
+          <w:numId w:val="17"/>
+        </w:numPr>
+      </w:pPr>
+      <w:r>
+        <w:rPr>
+          <w:b/>
+          <w:bCs/>
+        </w:rPr>
+        <w:t>Education system features</w:t>
+      </w:r>
+    </w:p>
+    <w:p>
+      <w:pPr>
+        <w:numPr>
+          <w:ilvl w:val="1"/>
+          <w:numId w:val="17"/>
+        </w:numPr>
+      </w:pPr>
+      <w:r>
+        <w:t>From NCES and related tools: per-pupil expenditure, teacher salaries, student–teacher ratios, and shares of students by subgroup.</w:t>
+      </w:r>
+      <w:hyperlink r:id="rId13" w:tgtFrame="_blank" w:history="1">
         <w:r>
           <w:rPr>
             <w:rStyle w:val="Hyperlink"/>
@@ -1576,62 +2037,458 @@
     <w:p>
       <w:pPr>
         <w:numPr>
-          <w:ilvl w:val="2"/>
-          <w:numId w:val="15"/>
-        </w:numPr>
-      </w:pPr>
-      <w:r>
-        <w:t>There is policy-relevant context around demographic-adjusted scores, especially with NAEP data and adjusted comparisons.[</w:t>
-      </w:r>
-      <w:hyperlink r:id="rId10" w:history="1">
+          <w:ilvl w:val="0"/>
+          <w:numId w:val="17"/>
+        </w:numPr>
+      </w:pPr>
+      <w:r>
+        <w:rPr>
+          <w:b/>
+          <w:bCs/>
+        </w:rPr>
+        <w:t>Socioeconomic and demographic features</w:t>
+      </w:r>
+    </w:p>
+    <w:p>
+      <w:pPr>
+        <w:numPr>
+          <w:ilvl w:val="1"/>
+          <w:numId w:val="17"/>
+        </w:numPr>
+      </w:pPr>
+      <w:r>
+        <w:lastRenderedPageBreak/>
+        <w:t>State-level poverty, income, racial/ethnic composition, and English learner share; these are commonly used to adjust NAEP for demographic differences.[</w:t>
+      </w:r>
+      <w:proofErr w:type="spellStart"/>
+      <w:r>
+        <w:fldChar w:fldCharType="begin"/>
+      </w:r>
+      <w:r>
+        <w:instrText>HYPERLINK "https://apps.urban.org/features/naep/"</w:instrText>
+      </w:r>
+      <w:r>
+        <w:fldChar w:fldCharType="separate"/>
+      </w:r>
+      <w:r>
+        <w:rPr>
+          <w:rStyle w:val="Hyperlink"/>
+        </w:rPr>
+        <w:t>apps.urban</w:t>
+      </w:r>
+      <w:proofErr w:type="spellEnd"/>
+      <w:r>
+        <w:fldChar w:fldCharType="end"/>
+      </w:r>
+      <w:r>
+        <w:t>]</w:t>
+      </w:r>
+      <w:r>
+        <w:rPr>
+          <w:rFonts w:ascii="Arial" w:hAnsi="Arial" w:cs="Arial"/>
+        </w:rPr>
+        <w:t>​</w:t>
+      </w:r>
+    </w:p>
+    <w:p>
+      <w:pPr>
+        <w:numPr>
+          <w:ilvl w:val="0"/>
+          <w:numId w:val="17"/>
+        </w:numPr>
+      </w:pPr>
+      <w:r>
+        <w:rPr>
+          <w:b/>
+          <w:bCs/>
+        </w:rPr>
+        <w:t>Time dimension</w:t>
+      </w:r>
+    </w:p>
+    <w:p>
+      <w:pPr>
+        <w:numPr>
+          <w:ilvl w:val="1"/>
+          <w:numId w:val="17"/>
+        </w:numPr>
+      </w:pPr>
+      <w:r>
+        <w:t>Choose a window like 2010–2024 to balance having enough rows (states × years) and data quality.</w:t>
+      </w:r>
+      <w:hyperlink r:id="rId14" w:tgtFrame="_blank" w:history="1">
         <w:r>
           <w:rPr>
             <w:rStyle w:val="Hyperlink"/>
           </w:rPr>
-          <w:t>apps.urban</w:t>
+          <w:t>nces.ed+1</w:t>
         </w:r>
       </w:hyperlink>
-      <w:r>
-        <w:t>]</w:t>
-      </w:r>
-      <w:r>
-        <w:rPr>
-          <w:rFonts w:ascii="Arial" w:hAnsi="Arial" w:cs="Arial"/>
-        </w:rPr>
-        <w:t>​</w:t>
-      </w:r>
-    </w:p>
-    <w:p>
-      <w:pPr>
-        <w:numPr>
-          <w:ilvl w:val="0"/>
-          <w:numId w:val="15"/>
-        </w:numPr>
-      </w:pPr>
-      <w:r>
+    </w:p>
+    <w:p>
+      <w:r>
+        <w:t>That gives you a tabular dataset where each row is (state, year) and columns are features + a target variable.</w:t>
+      </w:r>
+    </w:p>
+    <w:p>
+      <w:pPr>
         <w:rPr>
           <w:b/>
           <w:bCs/>
         </w:rPr>
-        <w:t>Optional extension: Cluster states into “education profiles”</w:t>
+      </w:pPr>
+      <w:r>
+        <w:rPr>
+          <w:b/>
+          <w:bCs/>
+        </w:rPr>
+        <w:t>Recommended project shape</w:t>
+      </w:r>
+    </w:p>
+    <w:p>
+      <w:r>
+        <w:t>To make this achievable by April 20th, you can organize it roughly like this:</w:t>
+      </w:r>
+    </w:p>
+    <w:p>
+      <w:pPr>
+        <w:numPr>
+          <w:ilvl w:val="0"/>
+          <w:numId w:val="18"/>
+        </w:numPr>
+      </w:pPr>
+      <w:proofErr w:type="gramStart"/>
+      <w:r>
+        <w:rPr>
+          <w:b/>
+          <w:bCs/>
+        </w:rPr>
+        <w:t>Framing</w:t>
+      </w:r>
+      <w:proofErr w:type="gramEnd"/>
+      <w:r>
+        <w:rPr>
+          <w:b/>
+          <w:bCs/>
+        </w:rPr>
+        <w:t xml:space="preserve"> and data</w:t>
       </w:r>
     </w:p>
     <w:p>
       <w:pPr>
         <w:numPr>
           <w:ilvl w:val="1"/>
-          <w:numId w:val="15"/>
+          <w:numId w:val="18"/>
+        </w:numPr>
+      </w:pPr>
+      <w:r>
+        <w:t>Define your primary question: e.g., “To what extent can state-level graduation rates be predicted from educational and socioeconomic features?”</w:t>
+      </w:r>
+      <w:hyperlink r:id="rId15" w:tgtFrame="_blank" w:history="1">
+        <w:r>
+          <w:rPr>
+            <w:rStyle w:val="Hyperlink"/>
+          </w:rPr>
+          <w:t>nces.ed+1</w:t>
+        </w:r>
+      </w:hyperlink>
+    </w:p>
+    <w:p>
+      <w:pPr>
+        <w:numPr>
+          <w:ilvl w:val="1"/>
+          <w:numId w:val="18"/>
+        </w:numPr>
+      </w:pPr>
+      <w:r>
+        <w:t>Collect and merge 3–6 main data sources into one clean table of state-year observations.</w:t>
+      </w:r>
+      <w:hyperlink r:id="rId16" w:tgtFrame="_blank" w:history="1">
+        <w:r>
+          <w:rPr>
+            <w:rStyle w:val="Hyperlink"/>
+          </w:rPr>
+          <w:t>nationsreportcard+2</w:t>
+        </w:r>
+      </w:hyperlink>
+    </w:p>
+    <w:p>
+      <w:pPr>
+        <w:numPr>
+          <w:ilvl w:val="0"/>
+          <w:numId w:val="18"/>
+        </w:numPr>
+      </w:pPr>
+      <w:r>
+        <w:rPr>
+          <w:b/>
+          <w:bCs/>
+        </w:rPr>
+        <w:t>EDA and fairness-aware context</w:t>
+      </w:r>
+    </w:p>
+    <w:p>
+      <w:pPr>
+        <w:numPr>
+          <w:ilvl w:val="1"/>
+          <w:numId w:val="18"/>
+        </w:numPr>
+      </w:pPr>
+      <w:r>
+        <w:t>Plot distributions of graduation rates or NAEP scores and examine gaps across demographic characteristics, echoing findings that outcomes vary strongly by poverty and race/ethnicity.</w:t>
+      </w:r>
+      <w:hyperlink r:id="rId17" w:tgtFrame="_blank" w:history="1">
+        <w:r>
+          <w:rPr>
+            <w:rStyle w:val="Hyperlink"/>
+          </w:rPr>
+          <w:t>insidehighered+2</w:t>
+        </w:r>
+      </w:hyperlink>
+    </w:p>
+    <w:p>
+      <w:pPr>
+        <w:numPr>
+          <w:ilvl w:val="1"/>
+          <w:numId w:val="18"/>
+        </w:numPr>
+      </w:pPr>
+      <w:r>
+        <w:t>Check correlations and multicollinearity among features (e.g., income and spending</w:t>
+      </w:r>
+      <w:proofErr w:type="gramStart"/>
+      <w:r>
+        <w:t>).[</w:t>
+      </w:r>
+      <w:proofErr w:type="spellStart"/>
+      <w:proofErr w:type="gramEnd"/>
+      <w:r>
+        <w:fldChar w:fldCharType="begin"/>
+      </w:r>
+      <w:r>
+        <w:instrText>HYPERLINK "https://apps.urban.org/features/naep/"</w:instrText>
+      </w:r>
+      <w:r>
+        <w:fldChar w:fldCharType="separate"/>
+      </w:r>
+      <w:proofErr w:type="gramStart"/>
+      <w:r>
+        <w:rPr>
+          <w:rStyle w:val="Hyperlink"/>
+        </w:rPr>
+        <w:t>apps.urban</w:t>
+      </w:r>
+      <w:proofErr w:type="spellEnd"/>
+      <w:proofErr w:type="gramEnd"/>
+      <w:r>
+        <w:fldChar w:fldCharType="end"/>
+      </w:r>
+      <w:r>
+        <w:t>]</w:t>
+      </w:r>
+      <w:r>
+        <w:rPr>
+          <w:rFonts w:ascii="Arial" w:hAnsi="Arial" w:cs="Arial"/>
+        </w:rPr>
+        <w:t>​</w:t>
+      </w:r>
+    </w:p>
+    <w:p>
+      <w:pPr>
+        <w:numPr>
+          <w:ilvl w:val="0"/>
+          <w:numId w:val="18"/>
+        </w:numPr>
+      </w:pPr>
+      <w:r>
+        <w:rPr>
+          <w:b/>
+          <w:bCs/>
+        </w:rPr>
+        <w:t>Modeling</w:t>
+      </w:r>
+    </w:p>
+    <w:p>
+      <w:pPr>
+        <w:numPr>
+          <w:ilvl w:val="1"/>
+          <w:numId w:val="18"/>
+        </w:numPr>
+      </w:pPr>
+      <w:r>
+        <w:t>Baseline: regularized linear regression on standardized features to keep interpretability.</w:t>
+      </w:r>
+    </w:p>
+    <w:p>
+      <w:pPr>
+        <w:numPr>
+          <w:ilvl w:val="1"/>
+          <w:numId w:val="18"/>
+        </w:numPr>
+      </w:pPr>
+      <w:r>
+        <w:t>Stronger models: random forest / gradient boosting (</w:t>
+      </w:r>
+      <w:proofErr w:type="spellStart"/>
+      <w:r>
+        <w:t>XGBoost</w:t>
+      </w:r>
+      <w:proofErr w:type="spellEnd"/>
+      <w:r>
+        <w:t>/</w:t>
+      </w:r>
+      <w:proofErr w:type="spellStart"/>
+      <w:r>
+        <w:t>LightGBM</w:t>
+      </w:r>
+      <w:proofErr w:type="spellEnd"/>
+      <w:r>
+        <w:t>), with cross-validation across years or states.</w:t>
+      </w:r>
+    </w:p>
+    <w:p>
+      <w:pPr>
+        <w:numPr>
+          <w:ilvl w:val="1"/>
+          <w:numId w:val="18"/>
+        </w:numPr>
+      </w:pPr>
+      <w:r>
+        <w:t>Evaluate with R² and error metrics; compare models and discuss overfitting given small N.[</w:t>
+      </w:r>
+      <w:proofErr w:type="spellStart"/>
+      <w:r>
+        <w:fldChar w:fldCharType="begin"/>
+      </w:r>
+      <w:r>
+        <w:instrText>HYPERLINK "https://www.geeksforgeeks.org/machine-learning/clustering-metrics/"</w:instrText>
+      </w:r>
+      <w:r>
+        <w:fldChar w:fldCharType="separate"/>
+      </w:r>
+      <w:r>
+        <w:rPr>
+          <w:rStyle w:val="Hyperlink"/>
+        </w:rPr>
+        <w:t>geeksforgeeks</w:t>
+      </w:r>
+      <w:proofErr w:type="spellEnd"/>
+      <w:r>
+        <w:fldChar w:fldCharType="end"/>
+      </w:r>
+      <w:r>
+        <w:t>]</w:t>
+      </w:r>
+      <w:r>
+        <w:rPr>
+          <w:rFonts w:ascii="Arial" w:hAnsi="Arial" w:cs="Arial"/>
+        </w:rPr>
+        <w:t>​</w:t>
+      </w:r>
+    </w:p>
+    <w:p>
+      <w:pPr>
+        <w:numPr>
+          <w:ilvl w:val="0"/>
+          <w:numId w:val="18"/>
+        </w:numPr>
+      </w:pPr>
+      <w:r>
+        <w:rPr>
+          <w:b/>
+          <w:bCs/>
+        </w:rPr>
+        <w:t>Interpretation</w:t>
+      </w:r>
+    </w:p>
+    <w:p>
+      <w:pPr>
+        <w:numPr>
+          <w:ilvl w:val="1"/>
+          <w:numId w:val="18"/>
         </w:numPr>
       </w:pPr>
       <w:r>
         <w:lastRenderedPageBreak/>
-        <w:t>After training the regression model, reuse your standardized feature set (or model outputs) and apply clustering (e.g., K</w:t>
+        <w:t>Analyze feature importances or coefficients to see which factors are most predictive.</w:t>
+      </w:r>
+    </w:p>
+    <w:p>
+      <w:pPr>
+        <w:numPr>
+          <w:ilvl w:val="1"/>
+          <w:numId w:val="18"/>
+        </w:numPr>
+      </w:pPr>
+      <w:r>
+        <w:t xml:space="preserve">Compare predicted vs. actual state outcomes, highlighting states that over- or under-perform relative to their predicted </w:t>
+      </w:r>
+      <w:proofErr w:type="gramStart"/>
+      <w:r>
+        <w:t>values.[</w:t>
+      </w:r>
+      <w:proofErr w:type="spellStart"/>
+      <w:proofErr w:type="gramEnd"/>
+      <w:r>
+        <w:fldChar w:fldCharType="begin"/>
+      </w:r>
+      <w:r>
+        <w:instrText>HYPERLINK "https://apps.urban.org/features/naep/"</w:instrText>
+      </w:r>
+      <w:r>
+        <w:fldChar w:fldCharType="separate"/>
+      </w:r>
+      <w:proofErr w:type="gramStart"/>
+      <w:r>
+        <w:rPr>
+          <w:rStyle w:val="Hyperlink"/>
+        </w:rPr>
+        <w:t>apps.urban</w:t>
+      </w:r>
+      <w:proofErr w:type="spellEnd"/>
+      <w:proofErr w:type="gramEnd"/>
+      <w:r>
+        <w:fldChar w:fldCharType="end"/>
+      </w:r>
+      <w:r>
+        <w:t>]</w:t>
+      </w:r>
+      <w:r>
+        <w:rPr>
+          <w:rFonts w:ascii="Arial" w:hAnsi="Arial" w:cs="Arial"/>
+        </w:rPr>
+        <w:t>​</w:t>
+      </w:r>
+    </w:p>
+    <w:p>
+      <w:pPr>
+        <w:numPr>
+          <w:ilvl w:val="0"/>
+          <w:numId w:val="18"/>
+        </w:numPr>
+      </w:pPr>
+      <w:r>
+        <w:rPr>
+          <w:b/>
+          <w:bCs/>
+        </w:rPr>
+        <w:t>Clustering extension (if time)</w:t>
+      </w:r>
+    </w:p>
+    <w:p>
+      <w:pPr>
+        <w:numPr>
+          <w:ilvl w:val="1"/>
+          <w:numId w:val="18"/>
+        </w:numPr>
+      </w:pPr>
+      <w:r>
+        <w:t>Take the feature space (or residuals/predictions) and run K</w:t>
       </w:r>
       <w:r>
         <w:noBreakHyphen/>
-        <w:t>means) to group states with similar education and socioeconomic patterns.</w:t>
-      </w:r>
-      <w:hyperlink r:id="rId11" w:tgtFrame="_blank" w:history="1">
+        <w:t>means or another clustering algorithm to group states into 3–6 clusters.</w:t>
+      </w:r>
+      <w:hyperlink r:id="rId18" w:tgtFrame="_blank" w:history="1">
         <w:r>
           <w:rPr>
             <w:rStyle w:val="Hyperlink"/>
@@ -1644,23 +2501,53 @@
       <w:pPr>
         <w:numPr>
           <w:ilvl w:val="1"/>
-          <w:numId w:val="15"/>
-        </w:numPr>
-      </w:pPr>
-      <w:r>
-        <w:t xml:space="preserve">You can then interpret clusters as “high outcome, low spending,” “low outcome, high disadvantage,” etc., but frame them carefully as </w:t>
-      </w:r>
-      <w:r>
-        <w:rPr>
-          <w:b/>
-          <w:bCs/>
-        </w:rPr>
-        <w:t>profiles</w:t>
-      </w:r>
-      <w:r>
-        <w:t>, not absolute “best/worst” rankings.</w:t>
-      </w:r>
-      <w:hyperlink r:id="rId12" w:tgtFrame="_blank" w:history="1">
+          <w:numId w:val="18"/>
+        </w:numPr>
+      </w:pPr>
+      <w:r>
+        <w:t>Use silhouette or Davies–Bouldin scores to justify your choice of k.[</w:t>
+      </w:r>
+      <w:proofErr w:type="spellStart"/>
+      <w:r>
+        <w:fldChar w:fldCharType="begin"/>
+      </w:r>
+      <w:r>
+        <w:instrText>HYPERLINK "https://www.geeksforgeeks.org/machine-learning/clustering-metrics/"</w:instrText>
+      </w:r>
+      <w:r>
+        <w:fldChar w:fldCharType="separate"/>
+      </w:r>
+      <w:r>
+        <w:rPr>
+          <w:rStyle w:val="Hyperlink"/>
+        </w:rPr>
+        <w:t>geeksforgeeks</w:t>
+      </w:r>
+      <w:proofErr w:type="spellEnd"/>
+      <w:r>
+        <w:fldChar w:fldCharType="end"/>
+      </w:r>
+      <w:r>
+        <w:t>]</w:t>
+      </w:r>
+      <w:r>
+        <w:rPr>
+          <w:rFonts w:ascii="Arial" w:hAnsi="Arial" w:cs="Arial"/>
+        </w:rPr>
+        <w:t>​</w:t>
+      </w:r>
+    </w:p>
+    <w:p>
+      <w:pPr>
+        <w:numPr>
+          <w:ilvl w:val="1"/>
+          <w:numId w:val="18"/>
+        </w:numPr>
+      </w:pPr>
+      <w:r>
+        <w:t>Interpret clusters qualitatively in terms of spending, poverty, and outcomes, being explicit about limitations.</w:t>
+      </w:r>
+      <w:hyperlink r:id="rId19" w:tgtFrame="_blank" w:history="1">
         <w:r>
           <w:rPr>
             <w:rStyle w:val="Hyperlink"/>
@@ -1671,96 +2558,6 @@
     </w:p>
     <w:p>
       <w:pPr>
-        <w:numPr>
-          <w:ilvl w:val="1"/>
-          <w:numId w:val="15"/>
-        </w:numPr>
-      </w:pPr>
-      <w:r>
-        <w:t>You’ll have good material to discuss clustering pipeline and metrics like silhouette score or Davies–Bouldin index.[</w:t>
-      </w:r>
-      <w:hyperlink r:id="rId13" w:history="1">
-        <w:r>
-          <w:rPr>
-            <w:rStyle w:val="Hyperlink"/>
-          </w:rPr>
-          <w:t>geeksforgeeks</w:t>
-        </w:r>
-      </w:hyperlink>
-      <w:r>
-        <w:t>]</w:t>
-      </w:r>
-      <w:r>
-        <w:rPr>
-          <w:rFonts w:ascii="Arial" w:hAnsi="Arial" w:cs="Arial"/>
-        </w:rPr>
-        <w:t>​</w:t>
-      </w:r>
-    </w:p>
-    <w:p>
-      <w:r>
-        <w:t>Trying to build a single “Education Quality Index” that claims to rank states definitively is doable but risky, because:</w:t>
-      </w:r>
-    </w:p>
-    <w:p>
-      <w:pPr>
-        <w:numPr>
-          <w:ilvl w:val="0"/>
-          <w:numId w:val="16"/>
-        </w:numPr>
-      </w:pPr>
-      <w:r>
-        <w:t>You must choose weights and indicators, which can be somewhat arbitrary without a strong policy framework like NAEP-adjusted scores or expert guidelines.</w:t>
-      </w:r>
-      <w:hyperlink r:id="rId14" w:tgtFrame="_blank" w:history="1">
-        <w:r>
-          <w:rPr>
-            <w:rStyle w:val="Hyperlink"/>
-          </w:rPr>
-          <w:t>urban+1</w:t>
-        </w:r>
-      </w:hyperlink>
-    </w:p>
-    <w:p>
-      <w:pPr>
-        <w:numPr>
-          <w:ilvl w:val="0"/>
-          <w:numId w:val="16"/>
-        </w:numPr>
-      </w:pPr>
-      <w:r>
-        <w:t>Interpretation can be contentious, and you’ll spend time defending the index instead of showcasing ML techniques.[</w:t>
-      </w:r>
-      <w:hyperlink r:id="rId15" w:history="1">
-        <w:r>
-          <w:rPr>
-            <w:rStyle w:val="Hyperlink"/>
-          </w:rPr>
-          <w:t>apps.urban</w:t>
-        </w:r>
-      </w:hyperlink>
-      <w:r>
-        <w:t>]</w:t>
-      </w:r>
-      <w:r>
-        <w:rPr>
-          <w:rFonts w:ascii="Arial" w:hAnsi="Arial" w:cs="Arial"/>
-        </w:rPr>
-        <w:t>​</w:t>
-      </w:r>
-    </w:p>
-    <w:p>
-      <w:r>
-        <w:t>So I would frame your project as:</w:t>
-      </w:r>
-    </w:p>
-    <w:p>
-      <w:r>
-        <w:t>“Predicting state-level education outcomes from socioeconomic and policy features, with clustering-based profiles of state education systems (not a hard ranking).”</w:t>
-      </w:r>
-    </w:p>
-    <w:p>
-      <w:pPr>
         <w:rPr>
           <w:b/>
           <w:bCs/>
@@ -1771,19 +2568,30 @@
           <w:b/>
           <w:bCs/>
         </w:rPr>
-        <w:t>Data sources and structure (concrete plan)</w:t>
-      </w:r>
-    </w:p>
-    <w:p>
-      <w:r>
-        <w:t>Here is a realistic data backbone you can assemble:</w:t>
+        <w:t>How “best/worst” fits in responsibly</w:t>
+      </w:r>
+    </w:p>
+    <w:p>
+      <w:r>
+        <w:t>You can still touch the “best/worst educationally run states” idea, just with nuance:</w:t>
       </w:r>
     </w:p>
     <w:p>
       <w:pPr>
         <w:numPr>
           <w:ilvl w:val="0"/>
-          <w:numId w:val="17"/>
+          <w:numId w:val="19"/>
+        </w:numPr>
+      </w:pPr>
+      <w:r>
+        <w:t>Instead of a single ranking, show:</w:t>
+      </w:r>
+    </w:p>
+    <w:p>
+      <w:pPr>
+        <w:numPr>
+          <w:ilvl w:val="1"/>
+          <w:numId w:val="19"/>
         </w:numPr>
       </w:pPr>
       <w:r>
@@ -1791,37 +2599,49 @@
           <w:b/>
           <w:bCs/>
         </w:rPr>
-        <w:t>Outcome variable</w:t>
+        <w:t>Raw outcome rankings</w:t>
+      </w:r>
+      <w:r>
+        <w:t xml:space="preserve"> (graduation rate or NAEP),</w:t>
       </w:r>
     </w:p>
     <w:p>
       <w:pPr>
         <w:numPr>
           <w:ilvl w:val="1"/>
-          <w:numId w:val="17"/>
-        </w:numPr>
-      </w:pPr>
-      <w:r>
-        <w:t xml:space="preserve">State-level </w:t>
-      </w:r>
+          <w:numId w:val="19"/>
+        </w:numPr>
+      </w:pPr>
       <w:r>
         <w:rPr>
           <w:b/>
           <w:bCs/>
         </w:rPr>
-        <w:t>graduation rates</w:t>
-      </w:r>
-      <w:r>
-        <w:t>: NCES “Adjusted Cohort Graduation Rate (ACGR)” by state, public high school, over multiple years.[</w:t>
-      </w:r>
-      <w:hyperlink r:id="rId16" w:history="1">
-        <w:r>
-          <w:rPr>
-            <w:rStyle w:val="Hyperlink"/>
-          </w:rPr>
-          <w:t>nces.ed</w:t>
-        </w:r>
-      </w:hyperlink>
+        <w:t>Model-adjusted residuals</w:t>
+      </w:r>
+      <w:r>
+        <w:t xml:space="preserve"> (actual – predicted), where positive residuals may suggest states doing better than expected given their context.[</w:t>
+      </w:r>
+      <w:proofErr w:type="spellStart"/>
+      <w:r>
+        <w:fldChar w:fldCharType="begin"/>
+      </w:r>
+      <w:r>
+        <w:instrText>HYPERLINK "https://apps.urban.org/features/naep/"</w:instrText>
+      </w:r>
+      <w:r>
+        <w:fldChar w:fldCharType="separate"/>
+      </w:r>
+      <w:r>
+        <w:rPr>
+          <w:rStyle w:val="Hyperlink"/>
+        </w:rPr>
+        <w:t>apps.urban</w:t>
+      </w:r>
+      <w:proofErr w:type="spellEnd"/>
+      <w:r>
+        <w:fldChar w:fldCharType="end"/>
+      </w:r>
       <w:r>
         <w:t>]</w:t>
       </w:r>
@@ -1835,434 +2655,25 @@
     <w:p>
       <w:pPr>
         <w:numPr>
+          <w:ilvl w:val="0"/>
+          <w:numId w:val="19"/>
+        </w:numPr>
+      </w:pPr>
+      <w:r>
+        <w:t>Emphasize that:</w:t>
+      </w:r>
+    </w:p>
+    <w:p>
+      <w:pPr>
+        <w:numPr>
           <w:ilvl w:val="1"/>
-          <w:numId w:val="17"/>
-        </w:numPr>
-      </w:pPr>
-      <w:r>
-        <w:t xml:space="preserve">OR state-level </w:t>
-      </w:r>
-      <w:r>
-        <w:rPr>
-          <w:b/>
-          <w:bCs/>
-        </w:rPr>
-        <w:t>NAEP scores</w:t>
-      </w:r>
-      <w:r>
-        <w:t xml:space="preserve"> (math/reading, grade 4 or 8) for consistent, standardized test outcomes by state and year.</w:t>
-      </w:r>
-      <w:hyperlink r:id="rId17" w:tgtFrame="_blank" w:history="1">
-        <w:r>
-          <w:rPr>
-            <w:rStyle w:val="Hyperlink"/>
-          </w:rPr>
-          <w:t>nationsreportcard+1</w:t>
-        </w:r>
-      </w:hyperlink>
-    </w:p>
-    <w:p>
-      <w:pPr>
-        <w:numPr>
-          <w:ilvl w:val="0"/>
-          <w:numId w:val="17"/>
-        </w:numPr>
-      </w:pPr>
-      <w:r>
-        <w:rPr>
-          <w:b/>
-          <w:bCs/>
-        </w:rPr>
-        <w:t>Education system features</w:t>
-      </w:r>
-    </w:p>
-    <w:p>
-      <w:pPr>
-        <w:numPr>
-          <w:ilvl w:val="1"/>
-          <w:numId w:val="17"/>
-        </w:numPr>
-      </w:pPr>
-      <w:r>
-        <w:t>From NCES and related tools: per-pupil expenditure, teacher salaries, student–teacher ratios, and shares of students by subgroup.</w:t>
-      </w:r>
-      <w:hyperlink r:id="rId18" w:tgtFrame="_blank" w:history="1">
-        <w:r>
-          <w:rPr>
-            <w:rStyle w:val="Hyperlink"/>
-          </w:rPr>
-          <w:t>nces.ed+1</w:t>
-        </w:r>
-      </w:hyperlink>
-    </w:p>
-    <w:p>
-      <w:pPr>
-        <w:numPr>
-          <w:ilvl w:val="0"/>
-          <w:numId w:val="17"/>
-        </w:numPr>
-      </w:pPr>
-      <w:r>
-        <w:rPr>
-          <w:b/>
-          <w:bCs/>
-        </w:rPr>
-        <w:t>Socioeconomic and demographic features</w:t>
-      </w:r>
-    </w:p>
-    <w:p>
-      <w:pPr>
-        <w:numPr>
-          <w:ilvl w:val="1"/>
-          <w:numId w:val="17"/>
-        </w:numPr>
-      </w:pPr>
-      <w:r>
-        <w:lastRenderedPageBreak/>
-        <w:t>State-level poverty, income, racial/ethnic composition, and English learner share; these are commonly used to adjust NAEP for demographic differences.[</w:t>
-      </w:r>
-      <w:hyperlink r:id="rId19" w:history="1">
-        <w:r>
-          <w:rPr>
-            <w:rStyle w:val="Hyperlink"/>
-          </w:rPr>
-          <w:t>apps.urban</w:t>
-        </w:r>
-      </w:hyperlink>
-      <w:r>
-        <w:t>]</w:t>
-      </w:r>
-      <w:r>
-        <w:rPr>
-          <w:rFonts w:ascii="Arial" w:hAnsi="Arial" w:cs="Arial"/>
-        </w:rPr>
-        <w:t>​</w:t>
-      </w:r>
-    </w:p>
-    <w:p>
-      <w:pPr>
-        <w:numPr>
-          <w:ilvl w:val="0"/>
-          <w:numId w:val="17"/>
-        </w:numPr>
-      </w:pPr>
-      <w:r>
-        <w:rPr>
-          <w:b/>
-          <w:bCs/>
-        </w:rPr>
-        <w:t>Time dimension</w:t>
-      </w:r>
-    </w:p>
-    <w:p>
-      <w:pPr>
-        <w:numPr>
-          <w:ilvl w:val="1"/>
-          <w:numId w:val="17"/>
-        </w:numPr>
-      </w:pPr>
-      <w:r>
-        <w:t>Choose a window like 2010–2024 to balance having enough rows (states × years) and data quality.</w:t>
+          <w:numId w:val="19"/>
+        </w:numPr>
+      </w:pPr>
+      <w:r>
+        <w:t>Causality is not identified here; you’re predicting, not proving that spending or demographics cause the differences.</w:t>
       </w:r>
       <w:hyperlink r:id="rId20" w:tgtFrame="_blank" w:history="1">
-        <w:r>
-          <w:rPr>
-            <w:rStyle w:val="Hyperlink"/>
-          </w:rPr>
-          <w:t>nces.ed+1</w:t>
-        </w:r>
-      </w:hyperlink>
-    </w:p>
-    <w:p>
-      <w:r>
-        <w:t>That gives you a tabular dataset where each row is (state, year) and columns are features + a target variable.</w:t>
-      </w:r>
-    </w:p>
-    <w:p>
-      <w:pPr>
-        <w:rPr>
-          <w:b/>
-          <w:bCs/>
-        </w:rPr>
-      </w:pPr>
-      <w:r>
-        <w:rPr>
-          <w:b/>
-          <w:bCs/>
-        </w:rPr>
-        <w:t>Recommended project shape</w:t>
-      </w:r>
-    </w:p>
-    <w:p>
-      <w:r>
-        <w:t>To make this achievable by April 20th, you can organize it roughly like this:</w:t>
-      </w:r>
-    </w:p>
-    <w:p>
-      <w:pPr>
-        <w:numPr>
-          <w:ilvl w:val="0"/>
-          <w:numId w:val="18"/>
-        </w:numPr>
-      </w:pPr>
-      <w:r>
-        <w:rPr>
-          <w:b/>
-          <w:bCs/>
-        </w:rPr>
-        <w:t>Framing and data</w:t>
-      </w:r>
-    </w:p>
-    <w:p>
-      <w:pPr>
-        <w:numPr>
-          <w:ilvl w:val="1"/>
-          <w:numId w:val="18"/>
-        </w:numPr>
-      </w:pPr>
-      <w:r>
-        <w:t>Define your primary question: e.g., “To what extent can state-level graduation rates be predicted from educational and socioeconomic features?”</w:t>
-      </w:r>
-      <w:hyperlink r:id="rId21" w:tgtFrame="_blank" w:history="1">
-        <w:r>
-          <w:rPr>
-            <w:rStyle w:val="Hyperlink"/>
-          </w:rPr>
-          <w:t>nces.ed+1</w:t>
-        </w:r>
-      </w:hyperlink>
-    </w:p>
-    <w:p>
-      <w:pPr>
-        <w:numPr>
-          <w:ilvl w:val="1"/>
-          <w:numId w:val="18"/>
-        </w:numPr>
-      </w:pPr>
-      <w:r>
-        <w:t>Collect and merge 3–6 main data sources into one clean table of state-year observations.</w:t>
-      </w:r>
-      <w:hyperlink r:id="rId22" w:tgtFrame="_blank" w:history="1">
-        <w:r>
-          <w:rPr>
-            <w:rStyle w:val="Hyperlink"/>
-          </w:rPr>
-          <w:t>nationsreportcard+2</w:t>
-        </w:r>
-      </w:hyperlink>
-    </w:p>
-    <w:p>
-      <w:pPr>
-        <w:numPr>
-          <w:ilvl w:val="0"/>
-          <w:numId w:val="18"/>
-        </w:numPr>
-      </w:pPr>
-      <w:r>
-        <w:rPr>
-          <w:b/>
-          <w:bCs/>
-        </w:rPr>
-        <w:t>EDA and fairness-aware context</w:t>
-      </w:r>
-    </w:p>
-    <w:p>
-      <w:pPr>
-        <w:numPr>
-          <w:ilvl w:val="1"/>
-          <w:numId w:val="18"/>
-        </w:numPr>
-      </w:pPr>
-      <w:r>
-        <w:t>Plot distributions of graduation rates or NAEP scores and examine gaps across demographic characteristics, echoing findings that outcomes vary strongly by poverty and race/ethnicity.</w:t>
-      </w:r>
-      <w:hyperlink r:id="rId23" w:tgtFrame="_blank" w:history="1">
-        <w:r>
-          <w:rPr>
-            <w:rStyle w:val="Hyperlink"/>
-          </w:rPr>
-          <w:t>insidehighered+2</w:t>
-        </w:r>
-      </w:hyperlink>
-    </w:p>
-    <w:p>
-      <w:pPr>
-        <w:numPr>
-          <w:ilvl w:val="1"/>
-          <w:numId w:val="18"/>
-        </w:numPr>
-      </w:pPr>
-      <w:r>
-        <w:t>Check correlations and multicollinearity among features (e.g., income and spending).[</w:t>
-      </w:r>
-      <w:hyperlink r:id="rId24" w:history="1">
-        <w:r>
-          <w:rPr>
-            <w:rStyle w:val="Hyperlink"/>
-          </w:rPr>
-          <w:t>apps.urban</w:t>
-        </w:r>
-      </w:hyperlink>
-      <w:r>
-        <w:t>]</w:t>
-      </w:r>
-      <w:r>
-        <w:rPr>
-          <w:rFonts w:ascii="Arial" w:hAnsi="Arial" w:cs="Arial"/>
-        </w:rPr>
-        <w:t>​</w:t>
-      </w:r>
-    </w:p>
-    <w:p>
-      <w:pPr>
-        <w:numPr>
-          <w:ilvl w:val="0"/>
-          <w:numId w:val="18"/>
-        </w:numPr>
-      </w:pPr>
-      <w:r>
-        <w:rPr>
-          <w:b/>
-          <w:bCs/>
-        </w:rPr>
-        <w:t>Modeling</w:t>
-      </w:r>
-    </w:p>
-    <w:p>
-      <w:pPr>
-        <w:numPr>
-          <w:ilvl w:val="1"/>
-          <w:numId w:val="18"/>
-        </w:numPr>
-      </w:pPr>
-      <w:r>
-        <w:t>Baseline: regularized linear regression on standardized features to keep interpretability.</w:t>
-      </w:r>
-    </w:p>
-    <w:p>
-      <w:pPr>
-        <w:numPr>
-          <w:ilvl w:val="1"/>
-          <w:numId w:val="18"/>
-        </w:numPr>
-      </w:pPr>
-      <w:r>
-        <w:t>Stronger models: random forest / gradient boosting (XGBoost/LightGBM), with cross-validation across years or states.</w:t>
-      </w:r>
-    </w:p>
-    <w:p>
-      <w:pPr>
-        <w:numPr>
-          <w:ilvl w:val="1"/>
-          <w:numId w:val="18"/>
-        </w:numPr>
-      </w:pPr>
-      <w:r>
-        <w:t>Evaluate with R² and error metrics; compare models and discuss overfitting given small N.[</w:t>
-      </w:r>
-      <w:hyperlink r:id="rId25" w:history="1">
-        <w:r>
-          <w:rPr>
-            <w:rStyle w:val="Hyperlink"/>
-          </w:rPr>
-          <w:t>geeksforgeeks</w:t>
-        </w:r>
-      </w:hyperlink>
-      <w:r>
-        <w:t>]</w:t>
-      </w:r>
-      <w:r>
-        <w:rPr>
-          <w:rFonts w:ascii="Arial" w:hAnsi="Arial" w:cs="Arial"/>
-        </w:rPr>
-        <w:t>​</w:t>
-      </w:r>
-    </w:p>
-    <w:p>
-      <w:pPr>
-        <w:numPr>
-          <w:ilvl w:val="0"/>
-          <w:numId w:val="18"/>
-        </w:numPr>
-      </w:pPr>
-      <w:r>
-        <w:rPr>
-          <w:b/>
-          <w:bCs/>
-        </w:rPr>
-        <w:t>Interpretation</w:t>
-      </w:r>
-    </w:p>
-    <w:p>
-      <w:pPr>
-        <w:numPr>
-          <w:ilvl w:val="1"/>
-          <w:numId w:val="18"/>
-        </w:numPr>
-      </w:pPr>
-      <w:r>
-        <w:lastRenderedPageBreak/>
-        <w:t>Analyze feature importances or coefficients to see which factors are most predictive.</w:t>
-      </w:r>
-    </w:p>
-    <w:p>
-      <w:pPr>
-        <w:numPr>
-          <w:ilvl w:val="1"/>
-          <w:numId w:val="18"/>
-        </w:numPr>
-      </w:pPr>
-      <w:r>
-        <w:t>Compare predicted vs. actual state outcomes, highlighting states that over- or under-perform relative to their predicted values.[</w:t>
-      </w:r>
-      <w:hyperlink r:id="rId26" w:history="1">
-        <w:r>
-          <w:rPr>
-            <w:rStyle w:val="Hyperlink"/>
-          </w:rPr>
-          <w:t>apps.urban</w:t>
-        </w:r>
-      </w:hyperlink>
-      <w:r>
-        <w:t>]</w:t>
-      </w:r>
-      <w:r>
-        <w:rPr>
-          <w:rFonts w:ascii="Arial" w:hAnsi="Arial" w:cs="Arial"/>
-        </w:rPr>
-        <w:t>​</w:t>
-      </w:r>
-    </w:p>
-    <w:p>
-      <w:pPr>
-        <w:numPr>
-          <w:ilvl w:val="0"/>
-          <w:numId w:val="18"/>
-        </w:numPr>
-      </w:pPr>
-      <w:r>
-        <w:rPr>
-          <w:b/>
-          <w:bCs/>
-        </w:rPr>
-        <w:t>Clustering extension (if time)</w:t>
-      </w:r>
-    </w:p>
-    <w:p>
-      <w:pPr>
-        <w:numPr>
-          <w:ilvl w:val="1"/>
-          <w:numId w:val="18"/>
-        </w:numPr>
-      </w:pPr>
-      <w:r>
-        <w:t>Take the feature space (or residuals/predictions) and run K</w:t>
-      </w:r>
-      <w:r>
-        <w:noBreakHyphen/>
-        <w:t>means or another clustering algorithm to group states into 3–6 clusters.</w:t>
-      </w:r>
-      <w:hyperlink r:id="rId27" w:tgtFrame="_blank" w:history="1">
         <w:r>
           <w:rPr>
             <w:rStyle w:val="Hyperlink"/>
@@ -2275,181 +2686,39 @@
       <w:pPr>
         <w:numPr>
           <w:ilvl w:val="1"/>
-          <w:numId w:val="18"/>
-        </w:numPr>
-      </w:pPr>
-      <w:r>
-        <w:t>Use silhouette or Davies–Bouldin scores to justify your choice of k.[</w:t>
-      </w:r>
-      <w:hyperlink r:id="rId28" w:history="1">
-        <w:r>
-          <w:rPr>
-            <w:rStyle w:val="Hyperlink"/>
-          </w:rPr>
-          <w:t>geeksforgeeks</w:t>
-        </w:r>
-      </w:hyperlink>
-      <w:r>
-        <w:t>]</w:t>
-      </w:r>
-      <w:r>
-        <w:rPr>
-          <w:rFonts w:ascii="Arial" w:hAnsi="Arial" w:cs="Arial"/>
-        </w:rPr>
-        <w:t>​</w:t>
-      </w:r>
-    </w:p>
-    <w:p>
-      <w:pPr>
-        <w:numPr>
-          <w:ilvl w:val="1"/>
-          <w:numId w:val="18"/>
-        </w:numPr>
-      </w:pPr>
-      <w:r>
-        <w:t>Interpret clusters qualitatively in terms of spending, poverty, and outcomes, being explicit about limitations.</w:t>
-      </w:r>
-      <w:hyperlink r:id="rId29" w:tgtFrame="_blank" w:history="1">
-        <w:r>
-          <w:rPr>
-            <w:rStyle w:val="Hyperlink"/>
-          </w:rPr>
-          <w:t>pmc.ncbi.nlm.nih+1</w:t>
-        </w:r>
-      </w:hyperlink>
-    </w:p>
-    <w:p>
-      <w:pPr>
-        <w:rPr>
-          <w:b/>
-          <w:bCs/>
-        </w:rPr>
-      </w:pPr>
-      <w:r>
-        <w:rPr>
-          <w:b/>
-          <w:bCs/>
-        </w:rPr>
-        <w:t>How “best/worst” fits in responsibly</w:t>
-      </w:r>
-    </w:p>
-    <w:p>
-      <w:r>
-        <w:t>You can still touch the “best/worst educationally run states” idea, just with nuance:</w:t>
-      </w:r>
-    </w:p>
-    <w:p>
-      <w:pPr>
-        <w:numPr>
-          <w:ilvl w:val="0"/>
           <w:numId w:val="19"/>
         </w:numPr>
       </w:pPr>
       <w:r>
-        <w:t>Instead of a single ranking, show:</w:t>
-      </w:r>
-    </w:p>
-    <w:p>
-      <w:pPr>
-        <w:numPr>
-          <w:ilvl w:val="1"/>
-          <w:numId w:val="19"/>
-        </w:numPr>
-      </w:pPr>
-      <w:r>
-        <w:rPr>
-          <w:b/>
-          <w:bCs/>
-        </w:rPr>
-        <w:t>Raw outcome rankings</w:t>
-      </w:r>
-      <w:r>
-        <w:t xml:space="preserve"> (graduation rate or NAEP),</w:t>
-      </w:r>
-    </w:p>
-    <w:p>
-      <w:pPr>
-        <w:numPr>
-          <w:ilvl w:val="1"/>
-          <w:numId w:val="19"/>
-        </w:numPr>
-      </w:pPr>
-      <w:r>
-        <w:rPr>
-          <w:b/>
-          <w:bCs/>
-        </w:rPr>
-        <w:t>Model-adjusted residuals</w:t>
-      </w:r>
-      <w:r>
-        <w:t xml:space="preserve"> (actual – predicted), where positive residuals may suggest states doing better than expected given their context.[</w:t>
-      </w:r>
-      <w:hyperlink r:id="rId30" w:history="1">
-        <w:r>
-          <w:rPr>
-            <w:rStyle w:val="Hyperlink"/>
-          </w:rPr>
-          <w:t>apps.urban</w:t>
-        </w:r>
-      </w:hyperlink>
-      <w:r>
-        <w:t>]</w:t>
-      </w:r>
-      <w:r>
-        <w:rPr>
-          <w:rFonts w:ascii="Arial" w:hAnsi="Arial" w:cs="Arial"/>
-        </w:rPr>
-        <w:t>​</w:t>
-      </w:r>
-    </w:p>
-    <w:p>
-      <w:pPr>
-        <w:numPr>
-          <w:ilvl w:val="0"/>
-          <w:numId w:val="19"/>
-        </w:numPr>
-      </w:pPr>
-      <w:r>
-        <w:t>Emphasize that:</w:t>
-      </w:r>
-    </w:p>
-    <w:p>
-      <w:pPr>
-        <w:numPr>
-          <w:ilvl w:val="1"/>
-          <w:numId w:val="19"/>
-        </w:numPr>
-      </w:pPr>
-      <w:r>
-        <w:t>Causality is not identified here; you’re predicting, not proving that spending or demographics cause the differences.</w:t>
-      </w:r>
-      <w:hyperlink r:id="rId31" w:tgtFrame="_blank" w:history="1">
-        <w:r>
-          <w:rPr>
-            <w:rStyle w:val="Hyperlink"/>
-          </w:rPr>
-          <w:t>pmc.ncbi.nlm.nih+1</w:t>
-        </w:r>
-      </w:hyperlink>
-    </w:p>
-    <w:p>
-      <w:pPr>
-        <w:numPr>
-          <w:ilvl w:val="1"/>
-          <w:numId w:val="19"/>
-        </w:numPr>
-      </w:pPr>
-      <w:r>
-        <w:t>Differences may reflect unobserved variables (local policies, district-level factors).[</w:t>
-      </w:r>
-      <w:hyperlink r:id="rId32" w:history="1">
-        <w:r>
-          <w:rPr>
-            <w:rStyle w:val="Hyperlink"/>
-          </w:rPr>
-          <w:t>apps.urban</w:t>
-        </w:r>
-      </w:hyperlink>
+        <w:t>Differences may reflect unobserved variables (local policies, district-level factors</w:t>
+      </w:r>
+      <w:proofErr w:type="gramStart"/>
+      <w:r>
+        <w:t>).[</w:t>
+      </w:r>
+      <w:proofErr w:type="spellStart"/>
+      <w:proofErr w:type="gramEnd"/>
+      <w:r>
+        <w:fldChar w:fldCharType="begin"/>
+      </w:r>
+      <w:r>
+        <w:instrText>HYPERLINK "https://apps.urban.org/features/naep/"</w:instrText>
+      </w:r>
+      <w:r>
+        <w:fldChar w:fldCharType="separate"/>
+      </w:r>
+      <w:proofErr w:type="gramStart"/>
+      <w:r>
+        <w:rPr>
+          <w:rStyle w:val="Hyperlink"/>
+        </w:rPr>
+        <w:t>apps.urban</w:t>
+      </w:r>
+      <w:proofErr w:type="spellEnd"/>
+      <w:proofErr w:type="gramEnd"/>
+      <w:r>
+        <w:fldChar w:fldCharType="end"/>
+      </w:r>
       <w:r>
         <w:t>]</w:t>
       </w:r>
@@ -2616,7 +2885,7 @@
       <w:r>
         <w:t xml:space="preserve"> from education and socioeconomic features.</w:t>
       </w:r>
-      <w:hyperlink r:id="rId33" w:tgtFrame="_blank" w:history="1">
+      <w:hyperlink r:id="rId21" w:tgtFrame="_blank" w:history="1">
         <w:r>
           <w:rPr>
             <w:rStyle w:val="Hyperlink"/>
@@ -2645,7 +2914,7 @@
       <w:r>
         <w:t>, not a hard “best/worst” ranking.</w:t>
       </w:r>
-      <w:hyperlink r:id="rId34" w:tgtFrame="_blank" w:history="1">
+      <w:hyperlink r:id="rId22" w:tgtFrame="_blank" w:history="1">
         <w:r>
           <w:rPr>
             <w:rStyle w:val="Hyperlink"/>
@@ -2695,7 +2964,7 @@
       <w:r>
         <w:t>Policy-relevant interpretation grounded in real data.</w:t>
       </w:r>
-      <w:hyperlink r:id="rId35" w:tgtFrame="_blank" w:history="1">
+      <w:hyperlink r:id="rId23" w:tgtFrame="_blank" w:history="1">
         <w:r>
           <w:rPr>
             <w:rStyle w:val="Hyperlink"/>
@@ -2767,7 +3036,7 @@
       <w:r>
         <w:t xml:space="preserve"> tables with breakdowns by race/ethnicity and other student characteristics.</w:t>
       </w:r>
-      <w:hyperlink r:id="rId36" w:tgtFrame="_blank" w:history="1">
+      <w:hyperlink r:id="rId24" w:tgtFrame="_blank" w:history="1">
         <w:r>
           <w:rPr>
             <w:rStyle w:val="Hyperlink"/>
@@ -2786,7 +3055,7 @@
       <w:r>
         <w:t>You can download Excel tables for multiple years and reshape them into a (state, year) panel.</w:t>
       </w:r>
-      <w:hyperlink r:id="rId37" w:tgtFrame="_blank" w:history="1">
+      <w:hyperlink r:id="rId25" w:tgtFrame="_blank" w:history="1">
         <w:r>
           <w:rPr>
             <w:rStyle w:val="Hyperlink"/>
@@ -2810,14 +3079,26 @@
       <w:r>
         <w:t>Graduation rate is intuitive to non-technical readers.[</w:t>
       </w:r>
-      <w:hyperlink r:id="rId38" w:history="1">
-        <w:r>
-          <w:rPr>
-            <w:rStyle w:val="Hyperlink"/>
-          </w:rPr>
-          <w:t>nces.ed</w:t>
-        </w:r>
-      </w:hyperlink>
+      <w:proofErr w:type="spellStart"/>
+      <w:r>
+        <w:fldChar w:fldCharType="begin"/>
+      </w:r>
+      <w:r>
+        <w:instrText>HYPERLINK "https://nces.ed.gov/programs/coe/indicator/coi/high-school-graduation-rates"</w:instrText>
+      </w:r>
+      <w:r>
+        <w:fldChar w:fldCharType="separate"/>
+      </w:r>
+      <w:r>
+        <w:rPr>
+          <w:rStyle w:val="Hyperlink"/>
+        </w:rPr>
+        <w:t>nces.ed</w:t>
+      </w:r>
+      <w:proofErr w:type="spellEnd"/>
+      <w:r>
+        <w:fldChar w:fldCharType="end"/>
+      </w:r>
       <w:r>
         <w:t>]</w:t>
       </w:r>
@@ -2838,7 +3119,7 @@
       <w:r>
         <w:t>ACGR is a standard policy metric, with clear definitions.</w:t>
       </w:r>
-      <w:hyperlink r:id="rId39" w:tgtFrame="_blank" w:history="1">
+      <w:hyperlink r:id="rId26" w:tgtFrame="_blank" w:history="1">
         <w:r>
           <w:rPr>
             <w:rStyle w:val="Hyperlink"/>
@@ -2889,7 +3170,7 @@
       <w:r>
         <w:t>NAEP provides state-level scores by grade and subject, available for download or via an API.</w:t>
       </w:r>
-      <w:hyperlink r:id="rId40" w:tgtFrame="_blank" w:history="1">
+      <w:hyperlink r:id="rId27" w:tgtFrame="_blank" w:history="1">
         <w:r>
           <w:rPr>
             <w:rStyle w:val="Hyperlink"/>
@@ -2918,7 +3199,7 @@
       <w:r>
         <w:t>, demonstrating how to correct for composition differences.</w:t>
       </w:r>
-      <w:hyperlink r:id="rId41" w:tgtFrame="_blank" w:history="1">
+      <w:hyperlink r:id="rId28" w:tgtFrame="_blank" w:history="1">
         <w:r>
           <w:rPr>
             <w:rStyle w:val="Hyperlink"/>
@@ -2942,7 +3223,7 @@
       <w:r>
         <w:t>NAEP is standardized and designed for cross-state comparison; there is a rich methodological literature you can cite.</w:t>
       </w:r>
-      <w:hyperlink r:id="rId42" w:tgtFrame="_blank" w:history="1">
+      <w:hyperlink r:id="rId29" w:tgtFrame="_blank" w:history="1">
         <w:r>
           <w:rPr>
             <w:rStyle w:val="Hyperlink"/>
@@ -2961,7 +3242,7 @@
       <w:r>
         <w:t>You can optionally compute residuals or approximate demographic adjustments in your own models.</w:t>
       </w:r>
-      <w:hyperlink r:id="rId43" w:tgtFrame="_blank" w:history="1">
+      <w:hyperlink r:id="rId30" w:tgtFrame="_blank" w:history="1">
         <w:r>
           <w:rPr>
             <w:rStyle w:val="Hyperlink"/>
@@ -2983,16 +3264,35 @@
         </w:numPr>
       </w:pPr>
       <w:r>
-        <w:t>NAEP has testing years rather than annual data, so you get fewer time points.[</w:t>
-      </w:r>
-      <w:hyperlink r:id="rId44" w:history="1">
-        <w:r>
-          <w:rPr>
-            <w:rStyle w:val="Hyperlink"/>
-          </w:rPr>
-          <w:t>nces.ed</w:t>
-        </w:r>
-      </w:hyperlink>
+        <w:t xml:space="preserve">NAEP has testing years rather than annual data, so you get fewer time </w:t>
+      </w:r>
+      <w:proofErr w:type="gramStart"/>
+      <w:r>
+        <w:t>points.[</w:t>
+      </w:r>
+      <w:proofErr w:type="spellStart"/>
+      <w:proofErr w:type="gramEnd"/>
+      <w:r>
+        <w:fldChar w:fldCharType="begin"/>
+      </w:r>
+      <w:r>
+        <w:instrText>HYPERLINK "https://nces.ed.gov/nationsreportcard/data/"</w:instrText>
+      </w:r>
+      <w:r>
+        <w:fldChar w:fldCharType="separate"/>
+      </w:r>
+      <w:proofErr w:type="gramStart"/>
+      <w:r>
+        <w:rPr>
+          <w:rStyle w:val="Hyperlink"/>
+        </w:rPr>
+        <w:t>nces.ed</w:t>
+      </w:r>
+      <w:proofErr w:type="spellEnd"/>
+      <w:proofErr w:type="gramEnd"/>
+      <w:r>
+        <w:fldChar w:fldCharType="end"/>
+      </w:r>
       <w:r>
         <w:t>]</w:t>
       </w:r>
@@ -3088,7 +3388,7 @@
       <w:r>
         <w:t>Outcome: ACGR tables for several years, or NAEP state scores (e.g., grade 8 math and reading).</w:t>
       </w:r>
-      <w:hyperlink r:id="rId45" w:tgtFrame="_blank" w:history="1">
+      <w:hyperlink r:id="rId31" w:tgtFrame="_blank" w:history="1">
         <w:r>
           <w:rPr>
             <w:rStyle w:val="Hyperlink"/>
@@ -3107,7 +3407,7 @@
       <w:r>
         <w:t>Features: state-level education finance and staffing variables from NCES; state socioeconomic indicators from a consistent source.</w:t>
       </w:r>
-      <w:hyperlink r:id="rId46" w:tgtFrame="_blank" w:history="1">
+      <w:hyperlink r:id="rId32" w:tgtFrame="_blank" w:history="1">
         <w:r>
           <w:rPr>
             <w:rStyle w:val="Hyperlink"/>
@@ -3148,6 +3448,840 @@
       <w:r>
         <w:lastRenderedPageBreak/>
         <w:t>Columns: outcome + features (spending per pupil, student–teacher ratio, teacher salary, poverty rate, median income, % English learners, etc.).</w:t>
+      </w:r>
+      <w:hyperlink r:id="rId33" w:tgtFrame="_blank" w:history="1">
+        <w:r>
+          <w:rPr>
+            <w:rStyle w:val="Hyperlink"/>
+          </w:rPr>
+          <w:t>urban+1</w:t>
+        </w:r>
+      </w:hyperlink>
+    </w:p>
+    <w:p>
+      <w:pPr>
+        <w:rPr>
+          <w:b/>
+          <w:bCs/>
+        </w:rPr>
+      </w:pPr>
+      <w:r>
+        <w:rPr>
+          <w:b/>
+          <w:bCs/>
+        </w:rPr>
+        <w:t>2. Exploratory analysis</w:t>
+      </w:r>
+    </w:p>
+    <w:p>
+      <w:pPr>
+        <w:numPr>
+          <w:ilvl w:val="0"/>
+          <w:numId w:val="30"/>
+        </w:numPr>
+      </w:pPr>
+      <w:r>
+        <w:t>Visualize distributions and trends of the outcome across states and time.</w:t>
+      </w:r>
+      <w:hyperlink r:id="rId34" w:tgtFrame="_blank" w:history="1">
+        <w:r>
+          <w:rPr>
+            <w:rStyle w:val="Hyperlink"/>
+          </w:rPr>
+          <w:t>nces.ed+1</w:t>
+        </w:r>
+      </w:hyperlink>
+    </w:p>
+    <w:p>
+      <w:pPr>
+        <w:numPr>
+          <w:ilvl w:val="0"/>
+          <w:numId w:val="30"/>
+        </w:numPr>
+      </w:pPr>
+      <w:r>
+        <w:t xml:space="preserve">Examine bivariate relationships (e.g., spending vs. graduation rate) and correlations among </w:t>
+      </w:r>
+      <w:proofErr w:type="gramStart"/>
+      <w:r>
+        <w:t>features.[</w:t>
+      </w:r>
+      <w:proofErr w:type="spellStart"/>
+      <w:proofErr w:type="gramEnd"/>
+      <w:r>
+        <w:fldChar w:fldCharType="begin"/>
+      </w:r>
+      <w:r>
+        <w:instrText>HYPERLINK "https://apps.urban.org/features/naep/"</w:instrText>
+      </w:r>
+      <w:r>
+        <w:fldChar w:fldCharType="separate"/>
+      </w:r>
+      <w:proofErr w:type="gramStart"/>
+      <w:r>
+        <w:rPr>
+          <w:rStyle w:val="Hyperlink"/>
+        </w:rPr>
+        <w:t>apps.urban</w:t>
+      </w:r>
+      <w:proofErr w:type="spellEnd"/>
+      <w:proofErr w:type="gramEnd"/>
+      <w:r>
+        <w:fldChar w:fldCharType="end"/>
+      </w:r>
+      <w:r>
+        <w:t>]</w:t>
+      </w:r>
+      <w:r>
+        <w:rPr>
+          <w:rFonts w:ascii="Arial" w:hAnsi="Arial" w:cs="Arial"/>
+        </w:rPr>
+        <w:t>​</w:t>
+      </w:r>
+    </w:p>
+    <w:p>
+      <w:pPr>
+        <w:numPr>
+          <w:ilvl w:val="0"/>
+          <w:numId w:val="30"/>
+        </w:numPr>
+      </w:pPr>
+      <w:r>
+        <w:t>Bring in literature highlights (e.g., socioeconomic differences in high school outcomes) as context, not as your own findings.</w:t>
+      </w:r>
+      <w:hyperlink r:id="rId35" w:tgtFrame="_blank" w:history="1">
+        <w:r>
+          <w:rPr>
+            <w:rStyle w:val="Hyperlink"/>
+          </w:rPr>
+          <w:t>insidehighered+2</w:t>
+        </w:r>
+      </w:hyperlink>
+    </w:p>
+    <w:p>
+      <w:pPr>
+        <w:rPr>
+          <w:b/>
+          <w:bCs/>
+        </w:rPr>
+      </w:pPr>
+      <w:r>
+        <w:rPr>
+          <w:b/>
+          <w:bCs/>
+        </w:rPr>
+        <w:t>3. Supervised modeling (regression)</w:t>
+      </w:r>
+    </w:p>
+    <w:p>
+      <w:r>
+        <w:t>Use scikit</w:t>
+      </w:r>
+      <w:r>
+        <w:noBreakHyphen/>
+        <w:t>learn pipelines with:</w:t>
+      </w:r>
+    </w:p>
+    <w:p>
+      <w:pPr>
+        <w:numPr>
+          <w:ilvl w:val="0"/>
+          <w:numId w:val="31"/>
+        </w:numPr>
+      </w:pPr>
+      <w:r>
+        <w:t>Preprocessing:</w:t>
+      </w:r>
+    </w:p>
+    <w:p>
+      <w:pPr>
+        <w:numPr>
+          <w:ilvl w:val="1"/>
+          <w:numId w:val="31"/>
+        </w:numPr>
+      </w:pPr>
+      <w:r>
+        <w:t>Imputation for missing values.</w:t>
+      </w:r>
+    </w:p>
+    <w:p>
+      <w:pPr>
+        <w:numPr>
+          <w:ilvl w:val="1"/>
+          <w:numId w:val="31"/>
+        </w:numPr>
+      </w:pPr>
+      <w:r>
+        <w:t>Standardization for numeric features.</w:t>
+      </w:r>
+    </w:p>
+    <w:p>
+      <w:pPr>
+        <w:numPr>
+          <w:ilvl w:val="0"/>
+          <w:numId w:val="31"/>
+        </w:numPr>
+      </w:pPr>
+      <w:r>
+        <w:t>Models:</w:t>
+      </w:r>
+    </w:p>
+    <w:p>
+      <w:pPr>
+        <w:numPr>
+          <w:ilvl w:val="1"/>
+          <w:numId w:val="31"/>
+        </w:numPr>
+      </w:pPr>
+      <w:r>
+        <w:t>Baseline: Ridge/Lasso regression (interpretability).</w:t>
+      </w:r>
+    </w:p>
+    <w:p>
+      <w:pPr>
+        <w:numPr>
+          <w:ilvl w:val="1"/>
+          <w:numId w:val="31"/>
+        </w:numPr>
+      </w:pPr>
+      <w:r>
+        <w:t xml:space="preserve">Tree-based: </w:t>
+      </w:r>
+      <w:proofErr w:type="spellStart"/>
+      <w:r>
+        <w:t>RandomForestRegressor</w:t>
+      </w:r>
+      <w:proofErr w:type="spellEnd"/>
+      <w:r>
+        <w:t xml:space="preserve"> or </w:t>
+      </w:r>
+      <w:proofErr w:type="spellStart"/>
+      <w:r>
+        <w:t>GradientBoostingRegressor</w:t>
+      </w:r>
+      <w:proofErr w:type="spellEnd"/>
+      <w:r>
+        <w:t xml:space="preserve"> for non-linear effects.</w:t>
+      </w:r>
+    </w:p>
+    <w:p>
+      <w:pPr>
+        <w:numPr>
+          <w:ilvl w:val="0"/>
+          <w:numId w:val="31"/>
+        </w:numPr>
+      </w:pPr>
+      <w:r>
+        <w:t>Validation:</w:t>
+      </w:r>
+    </w:p>
+    <w:p>
+      <w:pPr>
+        <w:numPr>
+          <w:ilvl w:val="1"/>
+          <w:numId w:val="31"/>
+        </w:numPr>
+      </w:pPr>
+      <w:r>
+        <w:t>Cross-validation by year or by state, depending on whether you care more about temporal or cross-sectional generalization.</w:t>
+      </w:r>
+    </w:p>
+    <w:p>
+      <w:pPr>
+        <w:numPr>
+          <w:ilvl w:val="1"/>
+          <w:numId w:val="31"/>
+        </w:numPr>
+      </w:pPr>
+      <w:r>
+        <w:t>Metric: R² plus MAE or RMSE.[</w:t>
+      </w:r>
+      <w:proofErr w:type="spellStart"/>
+      <w:r>
+        <w:fldChar w:fldCharType="begin"/>
+      </w:r>
+      <w:r>
+        <w:instrText>HYPERLINK "https://www.geeksforgeeks.org/machine-learning/clustering-metrics/"</w:instrText>
+      </w:r>
+      <w:r>
+        <w:fldChar w:fldCharType="separate"/>
+      </w:r>
+      <w:r>
+        <w:rPr>
+          <w:rStyle w:val="Hyperlink"/>
+        </w:rPr>
+        <w:t>geeksforgeeks</w:t>
+      </w:r>
+      <w:proofErr w:type="spellEnd"/>
+      <w:r>
+        <w:fldChar w:fldCharType="end"/>
+      </w:r>
+      <w:r>
+        <w:t>]</w:t>
+      </w:r>
+      <w:r>
+        <w:rPr>
+          <w:rFonts w:ascii="Arial" w:hAnsi="Arial" w:cs="Arial"/>
+        </w:rPr>
+        <w:t>​</w:t>
+      </w:r>
+    </w:p>
+    <w:p>
+      <w:r>
+        <w:t>Deliverables for the paper:</w:t>
+      </w:r>
+    </w:p>
+    <w:p>
+      <w:pPr>
+        <w:numPr>
+          <w:ilvl w:val="0"/>
+          <w:numId w:val="32"/>
+        </w:numPr>
+      </w:pPr>
+      <w:r>
+        <w:t>Performance table comparing models.</w:t>
+      </w:r>
+    </w:p>
+    <w:p>
+      <w:pPr>
+        <w:numPr>
+          <w:ilvl w:val="0"/>
+          <w:numId w:val="32"/>
+        </w:numPr>
+      </w:pPr>
+      <w:r>
+        <w:t>Coefficient/feature importance plots and interpretation (e.g., higher poverty strongly associated with lower scores after controlling for other factors).[</w:t>
+      </w:r>
+      <w:proofErr w:type="spellStart"/>
+      <w:r>
+        <w:fldChar w:fldCharType="begin"/>
+      </w:r>
+      <w:r>
+        <w:instrText>HYPERLINK "https://apps.urban.org/features/naep/"</w:instrText>
+      </w:r>
+      <w:r>
+        <w:fldChar w:fldCharType="separate"/>
+      </w:r>
+      <w:r>
+        <w:rPr>
+          <w:rStyle w:val="Hyperlink"/>
+        </w:rPr>
+        <w:t>apps.urban</w:t>
+      </w:r>
+      <w:proofErr w:type="spellEnd"/>
+      <w:r>
+        <w:fldChar w:fldCharType="end"/>
+      </w:r>
+      <w:r>
+        <w:t>]</w:t>
+      </w:r>
+      <w:r>
+        <w:rPr>
+          <w:rFonts w:ascii="Arial" w:hAnsi="Arial" w:cs="Arial"/>
+        </w:rPr>
+        <w:t>​</w:t>
+      </w:r>
+    </w:p>
+    <w:p>
+      <w:pPr>
+        <w:numPr>
+          <w:ilvl w:val="0"/>
+          <w:numId w:val="32"/>
+        </w:numPr>
+      </w:pPr>
+      <w:r>
+        <w:t xml:space="preserve">Map or ranking of </w:t>
+      </w:r>
+      <w:r>
+        <w:rPr>
+          <w:b/>
+          <w:bCs/>
+        </w:rPr>
+        <w:t>model residuals</w:t>
+      </w:r>
+      <w:r>
+        <w:t xml:space="preserve"> (actual – predicted), interpreted cautiously as “doing better/worse than predicted given observed features,” not as causal proof.</w:t>
+      </w:r>
+      <w:hyperlink r:id="rId36" w:tgtFrame="_blank" w:history="1">
+        <w:r>
+          <w:rPr>
+            <w:rStyle w:val="Hyperlink"/>
+          </w:rPr>
+          <w:t>urban+1</w:t>
+        </w:r>
+      </w:hyperlink>
+    </w:p>
+    <w:p>
+      <w:pPr>
+        <w:rPr>
+          <w:b/>
+          <w:bCs/>
+        </w:rPr>
+      </w:pPr>
+      <w:r>
+        <w:rPr>
+          <w:b/>
+          <w:bCs/>
+        </w:rPr>
+        <w:lastRenderedPageBreak/>
+        <w:t>4. Clustering “education profiles” (optional but nice)</w:t>
+      </w:r>
+    </w:p>
+    <w:p>
+      <w:r>
+        <w:t>Using the same standardized feature set (and possibly outcome variables):</w:t>
+      </w:r>
+    </w:p>
+    <w:p>
+      <w:pPr>
+        <w:numPr>
+          <w:ilvl w:val="0"/>
+          <w:numId w:val="33"/>
+        </w:numPr>
+      </w:pPr>
+      <w:r>
+        <w:t>Run K</w:t>
+      </w:r>
+      <w:r>
+        <w:noBreakHyphen/>
+        <w:t xml:space="preserve">means </w:t>
+      </w:r>
+      <w:proofErr w:type="spellStart"/>
+      <w:r>
+        <w:t>for k</w:t>
+      </w:r>
+      <w:proofErr w:type="spellEnd"/>
+      <w:r>
+        <w:t xml:space="preserve"> in a small range (e.g., 3–6), compute silhouette score or Davies–Bouldin index to select k.</w:t>
+      </w:r>
+      <w:hyperlink r:id="rId37" w:tgtFrame="_blank" w:history="1">
+        <w:r>
+          <w:rPr>
+            <w:rStyle w:val="Hyperlink"/>
+          </w:rPr>
+          <w:t>pmc.ncbi.nlm.nih+1</w:t>
+        </w:r>
+      </w:hyperlink>
+    </w:p>
+    <w:p>
+      <w:pPr>
+        <w:numPr>
+          <w:ilvl w:val="0"/>
+          <w:numId w:val="33"/>
+        </w:numPr>
+      </w:pPr>
+      <w:r>
+        <w:t>Label clusters by their characteristic patterns: e.g., “high spending, high outcomes,” “low spending, moderate outcomes, high disadvantage.”</w:t>
+      </w:r>
+      <w:hyperlink r:id="rId38" w:tgtFrame="_blank" w:history="1">
+        <w:r>
+          <w:rPr>
+            <w:rStyle w:val="Hyperlink"/>
+          </w:rPr>
+          <w:t>pmc.ncbi.nlm.nih+1</w:t>
+        </w:r>
+      </w:hyperlink>
+    </w:p>
+    <w:p>
+      <w:pPr>
+        <w:numPr>
+          <w:ilvl w:val="0"/>
+          <w:numId w:val="33"/>
+        </w:numPr>
+      </w:pPr>
+      <w:r>
+        <w:t>Visualize clusters on a U.S. map or 2D projection (PCA or t</w:t>
+      </w:r>
+      <w:r>
+        <w:noBreakHyphen/>
+        <w:t>SNE) to give an intuitive sense of which states resemble each other.</w:t>
+      </w:r>
+      <w:hyperlink r:id="rId39" w:tgtFrame="_blank" w:history="1">
+        <w:r>
+          <w:rPr>
+            <w:rStyle w:val="Hyperlink"/>
+          </w:rPr>
+          <w:t>geeksforgeeks+1</w:t>
+        </w:r>
+      </w:hyperlink>
+    </w:p>
+    <w:p>
+      <w:r>
+        <w:t xml:space="preserve">In the write-up, you can argue that this clustering is an </w:t>
+      </w:r>
+      <w:r>
+        <w:rPr>
+          <w:b/>
+          <w:bCs/>
+        </w:rPr>
+        <w:t>unsupervised “education profile” index</w:t>
+      </w:r>
+      <w:r>
+        <w:t>, avoiding the pitfalls of assigning a single numeric “quality score” and pretending it is ground truth.</w:t>
+      </w:r>
+      <w:hyperlink r:id="rId40" w:tgtFrame="_blank" w:history="1">
+        <w:r>
+          <w:rPr>
+            <w:rStyle w:val="Hyperlink"/>
+          </w:rPr>
+          <w:t>pmc.ncbi.nlm.nih+1</w:t>
+        </w:r>
+      </w:hyperlink>
+    </w:p>
+    <w:p>
+      <w:pPr>
+        <w:rPr>
+          <w:b/>
+          <w:bCs/>
+        </w:rPr>
+      </w:pPr>
+      <w:r>
+        <w:rPr>
+          <w:b/>
+          <w:bCs/>
+        </w:rPr>
+        <w:t>Week-by-week outline (from now to April 20th)</w:t>
+      </w:r>
+    </w:p>
+    <w:p>
+      <w:r>
+        <w:t>Assuming ~10 weeks:</w:t>
+      </w:r>
+    </w:p>
+    <w:p>
+      <w:pPr>
+        <w:numPr>
+          <w:ilvl w:val="0"/>
+          <w:numId w:val="34"/>
+        </w:numPr>
+      </w:pPr>
+      <w:r>
+        <w:t>Weeks 1–2</w:t>
+      </w:r>
+    </w:p>
+    <w:p>
+      <w:pPr>
+        <w:numPr>
+          <w:ilvl w:val="1"/>
+          <w:numId w:val="34"/>
+        </w:numPr>
+      </w:pPr>
+      <w:r>
+        <w:t>Finalize outcome choice (ACGR vs NAEP).</w:t>
+      </w:r>
+    </w:p>
+    <w:p>
+      <w:pPr>
+        <w:numPr>
+          <w:ilvl w:val="1"/>
+          <w:numId w:val="34"/>
+        </w:numPr>
+      </w:pPr>
+      <w:r>
+        <w:t>Download and merge core data; define a clean analysis dataset.</w:t>
+      </w:r>
+      <w:hyperlink r:id="rId41" w:tgtFrame="_blank" w:history="1">
+        <w:r>
+          <w:rPr>
+            <w:rStyle w:val="Hyperlink"/>
+          </w:rPr>
+          <w:t>nces.ed+1</w:t>
+        </w:r>
+      </w:hyperlink>
+    </w:p>
+    <w:p>
+      <w:pPr>
+        <w:numPr>
+          <w:ilvl w:val="0"/>
+          <w:numId w:val="34"/>
+        </w:numPr>
+      </w:pPr>
+      <w:r>
+        <w:t>Weeks 3–4</w:t>
+      </w:r>
+    </w:p>
+    <w:p>
+      <w:pPr>
+        <w:numPr>
+          <w:ilvl w:val="1"/>
+          <w:numId w:val="34"/>
+        </w:numPr>
+      </w:pPr>
+      <w:r>
+        <w:t>EDA and literature review; position your research question relative to prior work on graduation/NAEP and socioeconomic differences.</w:t>
+      </w:r>
+      <w:hyperlink r:id="rId42" w:tgtFrame="_blank" w:history="1">
+        <w:r>
+          <w:rPr>
+            <w:rStyle w:val="Hyperlink"/>
+          </w:rPr>
+          <w:t>pmc.ncbi.nlm.nih+2</w:t>
+        </w:r>
+      </w:hyperlink>
+    </w:p>
+    <w:p>
+      <w:pPr>
+        <w:numPr>
+          <w:ilvl w:val="1"/>
+          <w:numId w:val="34"/>
+        </w:numPr>
+      </w:pPr>
+      <w:r>
+        <w:t>Decide on the final feature set and handle missingness.</w:t>
+      </w:r>
+      <w:hyperlink r:id="rId43" w:tgtFrame="_blank" w:history="1">
+        <w:r>
+          <w:rPr>
+            <w:rStyle w:val="Hyperlink"/>
+          </w:rPr>
+          <w:t>nces.ed+1</w:t>
+        </w:r>
+      </w:hyperlink>
+    </w:p>
+    <w:p>
+      <w:pPr>
+        <w:numPr>
+          <w:ilvl w:val="0"/>
+          <w:numId w:val="34"/>
+        </w:numPr>
+      </w:pPr>
+      <w:r>
+        <w:t>Weeks 5–6</w:t>
+      </w:r>
+    </w:p>
+    <w:p>
+      <w:pPr>
+        <w:numPr>
+          <w:ilvl w:val="1"/>
+          <w:numId w:val="34"/>
+        </w:numPr>
+      </w:pPr>
+      <w:r>
+        <w:t>Implement and tune baseline and tree-based regression models with cross-validation.</w:t>
+      </w:r>
+    </w:p>
+    <w:p>
+      <w:pPr>
+        <w:numPr>
+          <w:ilvl w:val="1"/>
+          <w:numId w:val="34"/>
+        </w:numPr>
+      </w:pPr>
+      <w:r>
+        <w:t>Document performance and start drafting methods and results.[</w:t>
+      </w:r>
+      <w:proofErr w:type="spellStart"/>
+      <w:r>
+        <w:fldChar w:fldCharType="begin"/>
+      </w:r>
+      <w:r>
+        <w:instrText>HYPERLINK "https://www.geeksforgeeks.org/machine-learning/clustering-metrics/"</w:instrText>
+      </w:r>
+      <w:r>
+        <w:fldChar w:fldCharType="separate"/>
+      </w:r>
+      <w:r>
+        <w:rPr>
+          <w:rStyle w:val="Hyperlink"/>
+        </w:rPr>
+        <w:t>geeksforgeeks</w:t>
+      </w:r>
+      <w:proofErr w:type="spellEnd"/>
+      <w:r>
+        <w:fldChar w:fldCharType="end"/>
+      </w:r>
+      <w:r>
+        <w:t>]</w:t>
+      </w:r>
+      <w:r>
+        <w:rPr>
+          <w:rFonts w:ascii="Arial" w:hAnsi="Arial" w:cs="Arial"/>
+        </w:rPr>
+        <w:t>​</w:t>
+      </w:r>
+    </w:p>
+    <w:p>
+      <w:pPr>
+        <w:numPr>
+          <w:ilvl w:val="0"/>
+          <w:numId w:val="34"/>
+        </w:numPr>
+      </w:pPr>
+      <w:r>
+        <w:t>Weeks 7–8</w:t>
+      </w:r>
+    </w:p>
+    <w:p>
+      <w:pPr>
+        <w:numPr>
+          <w:ilvl w:val="1"/>
+          <w:numId w:val="34"/>
+        </w:numPr>
+      </w:pPr>
+      <w:r>
+        <w:t xml:space="preserve">Add feature importance and residual analysis; visualize over-/under-performing </w:t>
+      </w:r>
+      <w:proofErr w:type="gramStart"/>
+      <w:r>
+        <w:t>states.[</w:t>
+      </w:r>
+      <w:proofErr w:type="spellStart"/>
+      <w:proofErr w:type="gramEnd"/>
+      <w:r>
+        <w:fldChar w:fldCharType="begin"/>
+      </w:r>
+      <w:r>
+        <w:instrText>HYPERLINK "https://apps.urban.org/features/naep/"</w:instrText>
+      </w:r>
+      <w:r>
+        <w:fldChar w:fldCharType="separate"/>
+      </w:r>
+      <w:proofErr w:type="gramStart"/>
+      <w:r>
+        <w:rPr>
+          <w:rStyle w:val="Hyperlink"/>
+        </w:rPr>
+        <w:t>apps.urban</w:t>
+      </w:r>
+      <w:proofErr w:type="spellEnd"/>
+      <w:proofErr w:type="gramEnd"/>
+      <w:r>
+        <w:fldChar w:fldCharType="end"/>
+      </w:r>
+      <w:r>
+        <w:t>]</w:t>
+      </w:r>
+      <w:r>
+        <w:rPr>
+          <w:rFonts w:ascii="Arial" w:hAnsi="Arial" w:cs="Arial"/>
+        </w:rPr>
+        <w:t>​</w:t>
+      </w:r>
+    </w:p>
+    <w:p>
+      <w:pPr>
+        <w:numPr>
+          <w:ilvl w:val="1"/>
+          <w:numId w:val="34"/>
+        </w:numPr>
+      </w:pPr>
+      <w:r>
+        <w:lastRenderedPageBreak/>
+        <w:t>Implement clustering, choose k, interpret clusters.</w:t>
+      </w:r>
+      <w:hyperlink r:id="rId44" w:tgtFrame="_blank" w:history="1">
+        <w:r>
+          <w:rPr>
+            <w:rStyle w:val="Hyperlink"/>
+          </w:rPr>
+          <w:t>geeksforgeeks+1</w:t>
+        </w:r>
+      </w:hyperlink>
+    </w:p>
+    <w:p>
+      <w:pPr>
+        <w:numPr>
+          <w:ilvl w:val="0"/>
+          <w:numId w:val="34"/>
+        </w:numPr>
+      </w:pPr>
+      <w:r>
+        <w:t>Weeks 9–10</w:t>
+      </w:r>
+    </w:p>
+    <w:p>
+      <w:pPr>
+        <w:numPr>
+          <w:ilvl w:val="1"/>
+          <w:numId w:val="34"/>
+        </w:numPr>
+      </w:pPr>
+      <w:r>
+        <w:t>Polish figures, finalize write-up, add robustness checks (e.g., use a different subset of features or another outcome like reading vs math).</w:t>
+      </w:r>
+      <w:hyperlink r:id="rId45" w:tgtFrame="_blank" w:history="1">
+        <w:r>
+          <w:rPr>
+            <w:rStyle w:val="Hyperlink"/>
+          </w:rPr>
+          <w:t>urban+1</w:t>
+        </w:r>
+      </w:hyperlink>
+    </w:p>
+    <w:p>
+      <w:pPr>
+        <w:rPr>
+          <w:b/>
+          <w:bCs/>
+        </w:rPr>
+      </w:pPr>
+      <w:r>
+        <w:rPr>
+          <w:b/>
+          <w:bCs/>
+        </w:rPr>
+        <w:t>How to pitch it as “</w:t>
+      </w:r>
+      <w:proofErr w:type="spellStart"/>
+      <w:r>
+        <w:rPr>
+          <w:b/>
+          <w:bCs/>
+        </w:rPr>
+        <w:t>researchy</w:t>
+      </w:r>
+      <w:proofErr w:type="spellEnd"/>
+      <w:r>
+        <w:rPr>
+          <w:b/>
+          <w:bCs/>
+        </w:rPr>
+        <w:t>”</w:t>
+      </w:r>
+    </w:p>
+    <w:p>
+      <w:r>
+        <w:t>To make this stand out as a class/research project:</w:t>
+      </w:r>
+    </w:p>
+    <w:p>
+      <w:pPr>
+        <w:numPr>
+          <w:ilvl w:val="0"/>
+          <w:numId w:val="35"/>
+        </w:numPr>
+      </w:pPr>
+      <w:r>
+        <w:t>Anchor your work in policy literature using NAEP and graduation rate analyses and emphasize how demographic factors shape observed differences.</w:t>
+      </w:r>
+      <w:hyperlink r:id="rId46" w:tgtFrame="_blank" w:history="1">
+        <w:r>
+          <w:rPr>
+            <w:rStyle w:val="Hyperlink"/>
+          </w:rPr>
+          <w:t>pmc.ncbi.nlm.nih+3</w:t>
+        </w:r>
+      </w:hyperlink>
+    </w:p>
+    <w:p>
+      <w:pPr>
+        <w:numPr>
+          <w:ilvl w:val="0"/>
+          <w:numId w:val="35"/>
+        </w:numPr>
+      </w:pPr>
+      <w:r>
+        <w:t xml:space="preserve">Be explicit about </w:t>
+      </w:r>
+      <w:r>
+        <w:rPr>
+          <w:b/>
+          <w:bCs/>
+        </w:rPr>
+        <w:t>limitations</w:t>
+      </w:r>
+      <w:r>
+        <w:t>: small sample size (only 50 states), omitted variables, and observational nature.</w:t>
       </w:r>
       <w:hyperlink r:id="rId47" w:tgtFrame="_blank" w:history="1">
         <w:r>
@@ -3160,334 +4294,48 @@
     </w:p>
     <w:p>
       <w:pPr>
-        <w:rPr>
-          <w:b/>
-          <w:bCs/>
-        </w:rPr>
-      </w:pPr>
-      <w:r>
-        <w:rPr>
-          <w:b/>
-          <w:bCs/>
-        </w:rPr>
-        <w:t>2. Exploratory analysis</w:t>
-      </w:r>
-    </w:p>
-    <w:p>
-      <w:pPr>
         <w:numPr>
           <w:ilvl w:val="0"/>
-          <w:numId w:val="30"/>
-        </w:numPr>
-      </w:pPr>
-      <w:r>
-        <w:t>Visualize distributions and trends of the outcome across states and time.</w:t>
+          <w:numId w:val="35"/>
+        </w:numPr>
+      </w:pPr>
+      <w:r>
+        <w:t>Frame your contributions as:</w:t>
+      </w:r>
+    </w:p>
+    <w:p>
+      <w:pPr>
+        <w:numPr>
+          <w:ilvl w:val="1"/>
+          <w:numId w:val="35"/>
+        </w:numPr>
+      </w:pPr>
+      <w:r>
+        <w:t>A reproducible pipeline joining several public data sources.</w:t>
+      </w:r>
+    </w:p>
+    <w:p>
+      <w:pPr>
+        <w:numPr>
+          <w:ilvl w:val="1"/>
+          <w:numId w:val="35"/>
+        </w:numPr>
+      </w:pPr>
+      <w:r>
+        <w:t>A comparative evaluation of predictive models.</w:t>
+      </w:r>
+    </w:p>
+    <w:p>
+      <w:pPr>
+        <w:numPr>
+          <w:ilvl w:val="1"/>
+          <w:numId w:val="35"/>
+        </w:numPr>
+      </w:pPr>
+      <w:r>
+        <w:t>An interpretable cluster-based profiling of state education systems.</w:t>
       </w:r>
       <w:hyperlink r:id="rId48" w:tgtFrame="_blank" w:history="1">
-        <w:r>
-          <w:rPr>
-            <w:rStyle w:val="Hyperlink"/>
-          </w:rPr>
-          <w:t>nces.ed+1</w:t>
-        </w:r>
-      </w:hyperlink>
-    </w:p>
-    <w:p>
-      <w:pPr>
-        <w:numPr>
-          <w:ilvl w:val="0"/>
-          <w:numId w:val="30"/>
-        </w:numPr>
-      </w:pPr>
-      <w:r>
-        <w:t>Examine bivariate relationships (e.g., spending vs. graduation rate) and correlations among features.[</w:t>
-      </w:r>
-      <w:hyperlink r:id="rId49" w:history="1">
-        <w:r>
-          <w:rPr>
-            <w:rStyle w:val="Hyperlink"/>
-          </w:rPr>
-          <w:t>apps.urban</w:t>
-        </w:r>
-      </w:hyperlink>
-      <w:r>
-        <w:t>]</w:t>
-      </w:r>
-      <w:r>
-        <w:rPr>
-          <w:rFonts w:ascii="Arial" w:hAnsi="Arial" w:cs="Arial"/>
-        </w:rPr>
-        <w:t>​</w:t>
-      </w:r>
-    </w:p>
-    <w:p>
-      <w:pPr>
-        <w:numPr>
-          <w:ilvl w:val="0"/>
-          <w:numId w:val="30"/>
-        </w:numPr>
-      </w:pPr>
-      <w:r>
-        <w:t>Bring in literature highlights (e.g., socioeconomic differences in high school outcomes) as context, not as your own findings.</w:t>
-      </w:r>
-      <w:hyperlink r:id="rId50" w:tgtFrame="_blank" w:history="1">
-        <w:r>
-          <w:rPr>
-            <w:rStyle w:val="Hyperlink"/>
-          </w:rPr>
-          <w:t>insidehighered+2</w:t>
-        </w:r>
-      </w:hyperlink>
-    </w:p>
-    <w:p>
-      <w:pPr>
-        <w:rPr>
-          <w:b/>
-          <w:bCs/>
-        </w:rPr>
-      </w:pPr>
-      <w:r>
-        <w:rPr>
-          <w:b/>
-          <w:bCs/>
-        </w:rPr>
-        <w:t>3. Supervised modeling (regression)</w:t>
-      </w:r>
-    </w:p>
-    <w:p>
-      <w:r>
-        <w:t>Use scikit</w:t>
-      </w:r>
-      <w:r>
-        <w:noBreakHyphen/>
-        <w:t>learn pipelines with:</w:t>
-      </w:r>
-    </w:p>
-    <w:p>
-      <w:pPr>
-        <w:numPr>
-          <w:ilvl w:val="0"/>
-          <w:numId w:val="31"/>
-        </w:numPr>
-      </w:pPr>
-      <w:r>
-        <w:t>Preprocessing:</w:t>
-      </w:r>
-    </w:p>
-    <w:p>
-      <w:pPr>
-        <w:numPr>
-          <w:ilvl w:val="1"/>
-          <w:numId w:val="31"/>
-        </w:numPr>
-      </w:pPr>
-      <w:r>
-        <w:t>Imputation for missing values.</w:t>
-      </w:r>
-    </w:p>
-    <w:p>
-      <w:pPr>
-        <w:numPr>
-          <w:ilvl w:val="1"/>
-          <w:numId w:val="31"/>
-        </w:numPr>
-      </w:pPr>
-      <w:r>
-        <w:t>Standardization for numeric features.</w:t>
-      </w:r>
-    </w:p>
-    <w:p>
-      <w:pPr>
-        <w:numPr>
-          <w:ilvl w:val="0"/>
-          <w:numId w:val="31"/>
-        </w:numPr>
-      </w:pPr>
-      <w:r>
-        <w:t>Models:</w:t>
-      </w:r>
-    </w:p>
-    <w:p>
-      <w:pPr>
-        <w:numPr>
-          <w:ilvl w:val="1"/>
-          <w:numId w:val="31"/>
-        </w:numPr>
-      </w:pPr>
-      <w:r>
-        <w:t>Baseline: Ridge/Lasso regression (interpretability).</w:t>
-      </w:r>
-    </w:p>
-    <w:p>
-      <w:pPr>
-        <w:numPr>
-          <w:ilvl w:val="1"/>
-          <w:numId w:val="31"/>
-        </w:numPr>
-      </w:pPr>
-      <w:r>
-        <w:t>Tree-based: RandomForestRegressor or GradientBoostingRegressor for non-linear effects.</w:t>
-      </w:r>
-    </w:p>
-    <w:p>
-      <w:pPr>
-        <w:numPr>
-          <w:ilvl w:val="0"/>
-          <w:numId w:val="31"/>
-        </w:numPr>
-      </w:pPr>
-      <w:r>
-        <w:t>Validation:</w:t>
-      </w:r>
-    </w:p>
-    <w:p>
-      <w:pPr>
-        <w:numPr>
-          <w:ilvl w:val="1"/>
-          <w:numId w:val="31"/>
-        </w:numPr>
-      </w:pPr>
-      <w:r>
-        <w:t>Cross-validation by year or by state, depending on whether you care more about temporal or cross-sectional generalization.</w:t>
-      </w:r>
-    </w:p>
-    <w:p>
-      <w:pPr>
-        <w:numPr>
-          <w:ilvl w:val="1"/>
-          <w:numId w:val="31"/>
-        </w:numPr>
-      </w:pPr>
-      <w:r>
-        <w:t>Metric: R² plus MAE or RMSE.[</w:t>
-      </w:r>
-      <w:hyperlink r:id="rId51" w:history="1">
-        <w:r>
-          <w:rPr>
-            <w:rStyle w:val="Hyperlink"/>
-          </w:rPr>
-          <w:t>geeksforgeeks</w:t>
-        </w:r>
-      </w:hyperlink>
-      <w:r>
-        <w:t>]</w:t>
-      </w:r>
-      <w:r>
-        <w:rPr>
-          <w:rFonts w:ascii="Arial" w:hAnsi="Arial" w:cs="Arial"/>
-        </w:rPr>
-        <w:t>​</w:t>
-      </w:r>
-    </w:p>
-    <w:p>
-      <w:r>
-        <w:t>Deliverables for the paper:</w:t>
-      </w:r>
-    </w:p>
-    <w:p>
-      <w:pPr>
-        <w:numPr>
-          <w:ilvl w:val="0"/>
-          <w:numId w:val="32"/>
-        </w:numPr>
-      </w:pPr>
-      <w:r>
-        <w:t>Performance table comparing models.</w:t>
-      </w:r>
-    </w:p>
-    <w:p>
-      <w:pPr>
-        <w:numPr>
-          <w:ilvl w:val="0"/>
-          <w:numId w:val="32"/>
-        </w:numPr>
-      </w:pPr>
-      <w:r>
-        <w:t>Coefficient/feature importance plots and interpretation (e.g., higher poverty strongly associated with lower scores after controlling for other factors).[</w:t>
-      </w:r>
-      <w:hyperlink r:id="rId52" w:history="1">
-        <w:r>
-          <w:rPr>
-            <w:rStyle w:val="Hyperlink"/>
-          </w:rPr>
-          <w:t>apps.urban</w:t>
-        </w:r>
-      </w:hyperlink>
-      <w:r>
-        <w:t>]</w:t>
-      </w:r>
-      <w:r>
-        <w:rPr>
-          <w:rFonts w:ascii="Arial" w:hAnsi="Arial" w:cs="Arial"/>
-        </w:rPr>
-        <w:t>​</w:t>
-      </w:r>
-    </w:p>
-    <w:p>
-      <w:pPr>
-        <w:numPr>
-          <w:ilvl w:val="0"/>
-          <w:numId w:val="32"/>
-        </w:numPr>
-      </w:pPr>
-      <w:r>
-        <w:t xml:space="preserve">Map or ranking of </w:t>
-      </w:r>
-      <w:r>
-        <w:rPr>
-          <w:b/>
-          <w:bCs/>
-        </w:rPr>
-        <w:t>model residuals</w:t>
-      </w:r>
-      <w:r>
-        <w:t xml:space="preserve"> (actual – predicted), interpreted cautiously as “doing better/worse than predicted given observed features,” not as causal proof.</w:t>
-      </w:r>
-      <w:hyperlink r:id="rId53" w:tgtFrame="_blank" w:history="1">
-        <w:r>
-          <w:rPr>
-            <w:rStyle w:val="Hyperlink"/>
-          </w:rPr>
-          <w:t>urban+1</w:t>
-        </w:r>
-      </w:hyperlink>
-    </w:p>
-    <w:p>
-      <w:pPr>
-        <w:rPr>
-          <w:b/>
-          <w:bCs/>
-        </w:rPr>
-      </w:pPr>
-      <w:r>
-        <w:rPr>
-          <w:b/>
-          <w:bCs/>
-        </w:rPr>
-        <w:lastRenderedPageBreak/>
-        <w:t>4. Clustering “education profiles” (optional but nice)</w:t>
-      </w:r>
-    </w:p>
-    <w:p>
-      <w:r>
-        <w:t>Using the same standardized feature set (and possibly outcome variables):</w:t>
-      </w:r>
-    </w:p>
-    <w:p>
-      <w:pPr>
-        <w:numPr>
-          <w:ilvl w:val="0"/>
-          <w:numId w:val="33"/>
-        </w:numPr>
-      </w:pPr>
-      <w:r>
-        <w:t>Run K</w:t>
-      </w:r>
-      <w:r>
-        <w:noBreakHyphen/>
-        <w:t>means for k in a small range (e.g., 3–6), compute silhouette score or Davies–Bouldin index to select k.</w:t>
-      </w:r>
-      <w:hyperlink r:id="rId54" w:tgtFrame="_blank" w:history="1">
         <w:r>
           <w:rPr>
             <w:rStyle w:val="Hyperlink"/>
@@ -3498,518 +4346,92 @@
     </w:p>
     <w:p>
       <w:pPr>
+        <w:ind w:left="1440"/>
+      </w:pPr>
+    </w:p>
+    <w:p>
+      <w:r>
+        <w:t>To make your regression robust, ensure you include these specific socioeconomic markers from the Census/ACS:</w:t>
+      </w:r>
+    </w:p>
+    <w:p>
+      <w:pPr>
         <w:numPr>
           <w:ilvl w:val="0"/>
-          <w:numId w:val="33"/>
-        </w:numPr>
-      </w:pPr>
-      <w:r>
-        <w:t>Label clusters by their characteristic patterns: e.g., “high spending, high outcomes,” “low spending, moderate outcomes, high disadvantage.”</w:t>
-      </w:r>
-      <w:hyperlink r:id="rId55" w:tgtFrame="_blank" w:history="1">
-        <w:r>
-          <w:rPr>
-            <w:rStyle w:val="Hyperlink"/>
-          </w:rPr>
-          <w:t>pmc.ncbi.nlm.nih+1</w:t>
-        </w:r>
-      </w:hyperlink>
-    </w:p>
-    <w:p>
-      <w:pPr>
-        <w:numPr>
-          <w:ilvl w:val="0"/>
-          <w:numId w:val="33"/>
-        </w:numPr>
-      </w:pPr>
-      <w:r>
-        <w:t>Visualize clusters on a U.S. map or 2D projection (PCA or t</w:t>
-      </w:r>
-      <w:r>
-        <w:noBreakHyphen/>
-        <w:t>SNE) to give an intuitive sense of which states resemble each other.</w:t>
-      </w:r>
-      <w:hyperlink r:id="rId56" w:tgtFrame="_blank" w:history="1">
-        <w:r>
-          <w:rPr>
-            <w:rStyle w:val="Hyperlink"/>
-          </w:rPr>
-          <w:t>geeksforgeeks+1</w:t>
-        </w:r>
-      </w:hyperlink>
-    </w:p>
-    <w:p>
-      <w:r>
-        <w:t xml:space="preserve">In the write-up, you can argue that this clustering is an </w:t>
-      </w:r>
+          <w:numId w:val="37"/>
+        </w:numPr>
+      </w:pPr>
       <w:r>
         <w:rPr>
           <w:b/>
           <w:bCs/>
         </w:rPr>
-        <w:t>unsupervised “education profile” index</w:t>
-      </w:r>
-      <w:r>
-        <w:t>, avoiding the pitfalls of assigning a single numeric “quality score” and pretending it is ground truth.</w:t>
-      </w:r>
-      <w:hyperlink r:id="rId57" w:tgtFrame="_blank" w:history="1">
-        <w:r>
-          <w:rPr>
-            <w:rStyle w:val="Hyperlink"/>
-          </w:rPr>
-          <w:t>pmc.ncbi.nlm.nih+1</w:t>
-        </w:r>
-      </w:hyperlink>
-    </w:p>
-    <w:p>
-      <w:pPr>
+        <w:t>Poverty:</w:t>
+      </w:r>
+      <w:r>
+        <w:t xml:space="preserve"> % of children living below the federal poverty line.</w:t>
+      </w:r>
+    </w:p>
+    <w:p>
+      <w:pPr>
+        <w:numPr>
+          <w:ilvl w:val="0"/>
+          <w:numId w:val="37"/>
+        </w:numPr>
+      </w:pPr>
+      <w:r>
         <w:rPr>
           <w:b/>
           <w:bCs/>
         </w:rPr>
+        <w:t>Broadband Access:</w:t>
+      </w:r>
+      <w:r>
+        <w:t xml:space="preserve"> % of households with high-speed internet (a massive predictor post-2020).</w:t>
+      </w:r>
+    </w:p>
+    <w:p>
+      <w:pPr>
+        <w:numPr>
+          <w:ilvl w:val="0"/>
+          <w:numId w:val="37"/>
+        </w:numPr>
       </w:pPr>
       <w:r>
         <w:rPr>
           <w:b/>
           <w:bCs/>
         </w:rPr>
-        <w:t>Week-by-week outline (from now to April 20th)</w:t>
-      </w:r>
-    </w:p>
-    <w:p>
-      <w:r>
-        <w:t>Assuming ~10 weeks:</w:t>
+        <w:t>Gini Coefficient:</w:t>
+      </w:r>
+      <w:r>
+        <w:t xml:space="preserve"> State-level income inequality.</w:t>
       </w:r>
     </w:p>
     <w:p>
       <w:pPr>
         <w:numPr>
           <w:ilvl w:val="0"/>
-          <w:numId w:val="34"/>
-        </w:numPr>
-      </w:pPr>
-      <w:r>
-        <w:t>Weeks 1–2</w:t>
-      </w:r>
-    </w:p>
-    <w:p>
-      <w:pPr>
-        <w:numPr>
-          <w:ilvl w:val="1"/>
-          <w:numId w:val="34"/>
-        </w:numPr>
-      </w:pPr>
-      <w:r>
-        <w:t>Finalize outcome choice (ACGR vs NAEP).</w:t>
-      </w:r>
-    </w:p>
-    <w:p>
-      <w:pPr>
-        <w:numPr>
-          <w:ilvl w:val="1"/>
-          <w:numId w:val="34"/>
-        </w:numPr>
-      </w:pPr>
-      <w:r>
-        <w:t>Download and merge core data; define a clean analysis dataset.</w:t>
-      </w:r>
-      <w:hyperlink r:id="rId58" w:tgtFrame="_blank" w:history="1">
-        <w:r>
-          <w:rPr>
-            <w:rStyle w:val="Hyperlink"/>
-          </w:rPr>
-          <w:t>nces.ed+1</w:t>
-        </w:r>
-      </w:hyperlink>
-    </w:p>
-    <w:p>
-      <w:pPr>
-        <w:numPr>
-          <w:ilvl w:val="0"/>
-          <w:numId w:val="34"/>
-        </w:numPr>
-      </w:pPr>
-      <w:r>
-        <w:t>Weeks 3–4</w:t>
-      </w:r>
-    </w:p>
-    <w:p>
-      <w:pPr>
-        <w:numPr>
-          <w:ilvl w:val="1"/>
-          <w:numId w:val="34"/>
-        </w:numPr>
-      </w:pPr>
-      <w:r>
-        <w:t>EDA and literature review; position your research question relative to prior work on graduation/NAEP and socioeconomic differences.</w:t>
-      </w:r>
-      <w:hyperlink r:id="rId59" w:tgtFrame="_blank" w:history="1">
-        <w:r>
-          <w:rPr>
-            <w:rStyle w:val="Hyperlink"/>
-          </w:rPr>
-          <w:t>pmc.ncbi.nlm.nih+2</w:t>
-        </w:r>
-      </w:hyperlink>
-    </w:p>
-    <w:p>
-      <w:pPr>
-        <w:numPr>
-          <w:ilvl w:val="1"/>
-          <w:numId w:val="34"/>
-        </w:numPr>
-      </w:pPr>
-      <w:r>
-        <w:t>Decide on the final feature set and handle missingness.</w:t>
-      </w:r>
-      <w:hyperlink r:id="rId60" w:tgtFrame="_blank" w:history="1">
-        <w:r>
-          <w:rPr>
-            <w:rStyle w:val="Hyperlink"/>
-          </w:rPr>
-          <w:t>nces.ed+1</w:t>
-        </w:r>
-      </w:hyperlink>
-    </w:p>
-    <w:p>
-      <w:pPr>
-        <w:numPr>
-          <w:ilvl w:val="0"/>
-          <w:numId w:val="34"/>
-        </w:numPr>
-      </w:pPr>
-      <w:r>
-        <w:t>Weeks 5–6</w:t>
-      </w:r>
-    </w:p>
-    <w:p>
-      <w:pPr>
-        <w:numPr>
-          <w:ilvl w:val="1"/>
-          <w:numId w:val="34"/>
-        </w:numPr>
-      </w:pPr>
-      <w:r>
-        <w:t>Implement and tune baseline and tree-based regression models with cross-validation.</w:t>
-      </w:r>
-    </w:p>
-    <w:p>
-      <w:pPr>
-        <w:numPr>
-          <w:ilvl w:val="1"/>
-          <w:numId w:val="34"/>
-        </w:numPr>
-      </w:pPr>
-      <w:r>
-        <w:t>Document performance and start drafting methods and results.[</w:t>
-      </w:r>
-      <w:hyperlink r:id="rId61" w:history="1">
-        <w:r>
-          <w:rPr>
-            <w:rStyle w:val="Hyperlink"/>
-          </w:rPr>
-          <w:t>geeksforgeeks</w:t>
-        </w:r>
-      </w:hyperlink>
-      <w:r>
-        <w:t>]</w:t>
-      </w:r>
-      <w:r>
-        <w:rPr>
-          <w:rFonts w:ascii="Arial" w:hAnsi="Arial" w:cs="Arial"/>
-        </w:rPr>
-        <w:t>​</w:t>
-      </w:r>
-    </w:p>
-    <w:p>
-      <w:pPr>
-        <w:numPr>
-          <w:ilvl w:val="0"/>
-          <w:numId w:val="34"/>
-        </w:numPr>
-      </w:pPr>
-      <w:r>
-        <w:t>Weeks 7–8</w:t>
-      </w:r>
-    </w:p>
-    <w:p>
-      <w:pPr>
-        <w:numPr>
-          <w:ilvl w:val="1"/>
-          <w:numId w:val="34"/>
-        </w:numPr>
-      </w:pPr>
-      <w:r>
-        <w:t>Add feature importance and residual analysis; visualize over-/under-performing states.[</w:t>
-      </w:r>
-      <w:hyperlink r:id="rId62" w:history="1">
-        <w:r>
-          <w:rPr>
-            <w:rStyle w:val="Hyperlink"/>
-          </w:rPr>
-          <w:t>apps.urban</w:t>
-        </w:r>
-      </w:hyperlink>
-      <w:r>
-        <w:t>]</w:t>
-      </w:r>
-      <w:r>
-        <w:rPr>
-          <w:rFonts w:ascii="Arial" w:hAnsi="Arial" w:cs="Arial"/>
-        </w:rPr>
-        <w:t>​</w:t>
-      </w:r>
-    </w:p>
-    <w:p>
-      <w:pPr>
-        <w:numPr>
-          <w:ilvl w:val="1"/>
-          <w:numId w:val="34"/>
-        </w:numPr>
-      </w:pPr>
-      <w:r>
-        <w:lastRenderedPageBreak/>
-        <w:t>Implement clustering, choose k, interpret clusters.</w:t>
-      </w:r>
-      <w:hyperlink r:id="rId63" w:tgtFrame="_blank" w:history="1">
-        <w:r>
-          <w:rPr>
-            <w:rStyle w:val="Hyperlink"/>
-          </w:rPr>
-          <w:t>geeksforgeeks+1</w:t>
-        </w:r>
-      </w:hyperlink>
-    </w:p>
-    <w:p>
-      <w:pPr>
-        <w:numPr>
-          <w:ilvl w:val="0"/>
-          <w:numId w:val="34"/>
-        </w:numPr>
-      </w:pPr>
-      <w:r>
-        <w:t>Weeks 9–10</w:t>
-      </w:r>
-    </w:p>
-    <w:p>
-      <w:pPr>
-        <w:numPr>
-          <w:ilvl w:val="1"/>
-          <w:numId w:val="34"/>
-        </w:numPr>
-      </w:pPr>
-      <w:r>
-        <w:t>Polish figures, finalize write-up, add robustness checks (e.g., use a different subset of features or another outcome like reading vs math).</w:t>
-      </w:r>
-      <w:hyperlink r:id="rId64" w:tgtFrame="_blank" w:history="1">
-        <w:r>
-          <w:rPr>
-            <w:rStyle w:val="Hyperlink"/>
-          </w:rPr>
-          <w:t>urban+1</w:t>
-        </w:r>
-      </w:hyperlink>
-    </w:p>
-    <w:p>
-      <w:pPr>
+          <w:numId w:val="37"/>
+        </w:numPr>
+      </w:pPr>
+      <w:r>
         <w:rPr>
           <w:b/>
           <w:bCs/>
         </w:rPr>
-      </w:pPr>
-      <w:r>
-        <w:rPr>
-          <w:b/>
-          <w:bCs/>
-        </w:rPr>
-        <w:t>How to pitch it as “researchy”</w:t>
-      </w:r>
-    </w:p>
-    <w:p>
-      <w:r>
-        <w:t>To make this stand out as a class/research project:</w:t>
-      </w:r>
-    </w:p>
-    <w:p>
-      <w:pPr>
-        <w:numPr>
-          <w:ilvl w:val="0"/>
-          <w:numId w:val="35"/>
-        </w:numPr>
-      </w:pPr>
-      <w:r>
-        <w:t>Anchor your work in policy literature using NAEP and graduation rate analyses and emphasize how demographic factors shape observed differences.</w:t>
-      </w:r>
-      <w:hyperlink r:id="rId65" w:tgtFrame="_blank" w:history="1">
-        <w:r>
-          <w:rPr>
-            <w:rStyle w:val="Hyperlink"/>
-          </w:rPr>
-          <w:t>pmc.ncbi.nlm.nih+3</w:t>
-        </w:r>
-      </w:hyperlink>
-    </w:p>
-    <w:p>
-      <w:pPr>
-        <w:numPr>
-          <w:ilvl w:val="0"/>
-          <w:numId w:val="35"/>
-        </w:numPr>
-      </w:pPr>
-      <w:r>
-        <w:t xml:space="preserve">Be explicit about </w:t>
-      </w:r>
-      <w:r>
-        <w:rPr>
-          <w:b/>
-          <w:bCs/>
-        </w:rPr>
-        <w:t>limitations</w:t>
-      </w:r>
-      <w:r>
-        <w:t>: small sample size (only 50 states), omitted variables, and observational nature.</w:t>
-      </w:r>
-      <w:hyperlink r:id="rId66" w:tgtFrame="_blank" w:history="1">
-        <w:r>
-          <w:rPr>
-            <w:rStyle w:val="Hyperlink"/>
-          </w:rPr>
-          <w:t>urban+1</w:t>
-        </w:r>
-      </w:hyperlink>
-    </w:p>
-    <w:p>
-      <w:pPr>
-        <w:numPr>
-          <w:ilvl w:val="0"/>
-          <w:numId w:val="35"/>
-        </w:numPr>
-      </w:pPr>
-      <w:r>
-        <w:t>Frame your contributions as:</w:t>
-      </w:r>
-    </w:p>
-    <w:p>
-      <w:pPr>
-        <w:numPr>
-          <w:ilvl w:val="1"/>
-          <w:numId w:val="35"/>
-        </w:numPr>
-      </w:pPr>
-      <w:r>
-        <w:t>A reproducible pipeline joining several public data sources.</w:t>
-      </w:r>
-    </w:p>
-    <w:p>
-      <w:pPr>
-        <w:numPr>
-          <w:ilvl w:val="1"/>
-          <w:numId w:val="35"/>
-        </w:numPr>
-      </w:pPr>
-      <w:r>
-        <w:t>A comparative evaluation of predictive models.</w:t>
-      </w:r>
-    </w:p>
-    <w:p>
-      <w:pPr>
-        <w:numPr>
-          <w:ilvl w:val="1"/>
-          <w:numId w:val="35"/>
-        </w:numPr>
-      </w:pPr>
-      <w:r>
-        <w:t>An interpretable cluster-based profiling of state education systems.</w:t>
-      </w:r>
-      <w:hyperlink r:id="rId67" w:tgtFrame="_blank" w:history="1">
-        <w:r>
-          <w:rPr>
-            <w:rStyle w:val="Hyperlink"/>
-          </w:rPr>
-          <w:t>pmc.ncbi.nlm.nih+1</w:t>
-        </w:r>
-      </w:hyperlink>
-    </w:p>
-    <w:p>
-      <w:pPr>
-        <w:ind w:left="1440"/>
-      </w:pPr>
-    </w:p>
-    <w:p>
-      <w:r>
-        <w:t>To make your regression robust, ensure you include these specific socioeconomic markers from the Census/ACS:</w:t>
-      </w:r>
-    </w:p>
-    <w:p>
-      <w:pPr>
-        <w:numPr>
-          <w:ilvl w:val="0"/>
-          <w:numId w:val="37"/>
-        </w:numPr>
-      </w:pPr>
-      <w:r>
-        <w:rPr>
-          <w:b/>
-          <w:bCs/>
-        </w:rPr>
-        <w:t>Poverty:</w:t>
-      </w:r>
-      <w:r>
-        <w:t xml:space="preserve"> % of children living below the federal poverty line.</w:t>
-      </w:r>
-    </w:p>
-    <w:p>
-      <w:pPr>
-        <w:numPr>
-          <w:ilvl w:val="0"/>
-          <w:numId w:val="37"/>
-        </w:numPr>
-      </w:pPr>
-      <w:r>
-        <w:rPr>
-          <w:b/>
-          <w:bCs/>
-        </w:rPr>
-        <w:t>Broadband Access:</w:t>
-      </w:r>
-      <w:r>
-        <w:t xml:space="preserve"> % of households with high-speed internet (a massive predictor post-2020).</w:t>
-      </w:r>
-    </w:p>
-    <w:p>
-      <w:pPr>
-        <w:numPr>
-          <w:ilvl w:val="0"/>
-          <w:numId w:val="37"/>
-        </w:numPr>
-      </w:pPr>
-      <w:r>
-        <w:rPr>
-          <w:b/>
-          <w:bCs/>
-        </w:rPr>
-        <w:t>Gini Coefficient:</w:t>
-      </w:r>
-      <w:r>
-        <w:t xml:space="preserve"> State-level income inequality.</w:t>
-      </w:r>
-    </w:p>
-    <w:p>
-      <w:pPr>
-        <w:numPr>
-          <w:ilvl w:val="0"/>
-          <w:numId w:val="37"/>
-        </w:numPr>
-      </w:pPr>
-      <w:r>
-        <w:rPr>
-          <w:b/>
-          <w:bCs/>
-        </w:rPr>
         <w:t>Education Level:</w:t>
       </w:r>
       <w:r>
-        <w:t xml:space="preserve"> % of adults in the state with a Bachelor's degree.</w:t>
+        <w:t xml:space="preserve"> % of adults in the state with a </w:t>
+      </w:r>
+      <w:proofErr w:type="gramStart"/>
+      <w:r>
+        <w:t>Bachelor's</w:t>
+      </w:r>
+      <w:proofErr w:type="gramEnd"/>
+      <w:r>
+        <w:t xml:space="preserve"> degree.</w:t>
       </w:r>
     </w:p>
     <w:p/>
@@ -4151,7 +4573,15 @@
     </w:p>
     <w:p>
       <w:r>
-        <w:t>The features I will look into for now are: avg test score (or Graduation rate), Student-teacher ratio, Per-pupil spending, Median income, Poverty rate, Urbanization, Teacher salary,</w:t>
+        <w:t xml:space="preserve">The features I will </w:t>
+      </w:r>
+      <w:proofErr w:type="gramStart"/>
+      <w:r>
+        <w:t>look into</w:t>
+      </w:r>
+      <w:proofErr w:type="gramEnd"/>
+      <w:r>
+        <w:t xml:space="preserve"> for now are: avg test score (or Graduation rate), Student-teacher ratio, Per-pupil spending, Median income, Poverty rate, Urbanization, Teacher salary,</w:t>
       </w:r>
     </w:p>
     <w:p>
@@ -4162,8 +4592,13 @@
         <w:t>robably will use regression techniques like ridge or lasso</w:t>
       </w:r>
       <w:r>
-        <w:t>, or maybe a stronger model like XGBoost</w:t>
-      </w:r>
+        <w:t xml:space="preserve">, or maybe a stronger model like </w:t>
+      </w:r>
+      <w:proofErr w:type="spellStart"/>
+      <w:r>
+        <w:t>XGBoost</w:t>
+      </w:r>
+      <w:proofErr w:type="spellEnd"/>
       <w:r>
         <w:t>.</w:t>
       </w:r>
@@ -4225,12 +4660,25 @@
     </w:p>
     <w:p>
       <w:r>
-        <w:t>Please review the project description/syllabus for detailed info on word count, references, etc. :</w:t>
-      </w:r>
-    </w:p>
-    <w:p>
-      <w:r>
-        <w:t>“3,000 - 5,000 words. A minimum of 3,000 words is required. It is acceptable to slightly exceed the 5,000 word limit, provided it is not excessive; try to be concise * Projects are generally &gt; 10 pages without title/cover page, but this could vary with different formatting styles”</w:t>
+        <w:t xml:space="preserve">Please review the project description/syllabus for detailed info on word count, references, </w:t>
+      </w:r>
+      <w:proofErr w:type="gramStart"/>
+      <w:r>
+        <w:t>etc. :</w:t>
+      </w:r>
+      <w:proofErr w:type="gramEnd"/>
+    </w:p>
+    <w:p>
+      <w:r>
+        <w:t xml:space="preserve">“3,000 - 5,000 words. A minimum of 3,000 words is required. It is acceptable to slightly exceed the </w:t>
+      </w:r>
+      <w:proofErr w:type="gramStart"/>
+      <w:r>
+        <w:t>5,000 word</w:t>
+      </w:r>
+      <w:proofErr w:type="gramEnd"/>
+      <w:r>
+        <w:t xml:space="preserve"> limit, provided it is not excessive; try to be concise * Projects are generally &gt; 10 pages without title/cover page, but this could vary with different formatting styles”</w:t>
       </w:r>
     </w:p>
     <w:p>
@@ -4276,7 +4724,15 @@
     </w:p>
     <w:p>
       <w:r>
-        <w:t>PPE is per pupil, TE11 is total expenditures, E11A is teacher salary</w:t>
+        <w:t xml:space="preserve">PPE is per pupil, TE11 is total </w:t>
+      </w:r>
+      <w:proofErr w:type="gramStart"/>
+      <w:r>
+        <w:t>expenditures</w:t>
+      </w:r>
+      <w:proofErr w:type="gramEnd"/>
+      <w:r>
+        <w:t>, E11A is teacher salary</w:t>
       </w:r>
     </w:p>
     <w:p>
@@ -4290,12 +4746,28 @@
         <w:t>data,</w:t>
       </w:r>
       <w:r>
-        <w:t xml:space="preserve"> and I used average of teacher salary to do this.</w:t>
-      </w:r>
-    </w:p>
-    <w:p>
-      <w:r>
-        <w:t>Had to change the urbanization rate and poverty rate to the correct scale in the 2020 part of the dataset</w:t>
+        <w:t xml:space="preserve"> and I used </w:t>
+      </w:r>
+      <w:proofErr w:type="gramStart"/>
+      <w:r>
+        <w:t>average of</w:t>
+      </w:r>
+      <w:proofErr w:type="gramEnd"/>
+      <w:r>
+        <w:t xml:space="preserve"> teacher salary to do this.</w:t>
+      </w:r>
+    </w:p>
+    <w:p>
+      <w:r>
+        <w:t xml:space="preserve">Had to change the urbanization rate and poverty rate to the correct scale in </w:t>
+      </w:r>
+      <w:proofErr w:type="gramStart"/>
+      <w:r>
+        <w:t>the 2020 part</w:t>
+      </w:r>
+      <w:proofErr w:type="gramEnd"/>
+      <w:r>
+        <w:t xml:space="preserve"> of the dataset</w:t>
       </w:r>
     </w:p>
     <w:p/>
@@ -4328,7 +4800,15 @@
     </w:p>
     <w:p>
       <w:r>
-        <w:t>A Comparative Study to Predict Student’s Performance Using Educational Data Mining Techniques Annisa Uswatun Khasanah1), Harwati</w:t>
+        <w:t xml:space="preserve">A Comparative Study to Predict Student’s Performance Using Educational Data Mining Techniques Annisa </w:t>
+      </w:r>
+      <w:proofErr w:type="spellStart"/>
+      <w:r>
+        <w:t>Uswatun</w:t>
+      </w:r>
+      <w:proofErr w:type="spellEnd"/>
+      <w:r>
+        <w:t xml:space="preserve"> Khasanah1), Harwati</w:t>
       </w:r>
       <w:r>
         <w:t>2)</w:t>
@@ -4340,7 +4820,7 @@
       </w:r>
     </w:p>
     <w:p>
-      <w:hyperlink r:id="rId68" w:history="1">
+      <w:hyperlink r:id="rId49" w:history="1">
         <w:r>
           <w:rPr>
             <w:rStyle w:val="Hyperlink"/>
@@ -4391,9 +4871,30 @@
       </w:r>
     </w:p>
     <w:p/>
+    <w:p>
+      <w:r>
+        <w:t>7</w:t>
+      </w:r>
+    </w:p>
+    <w:p>
+      <w:hyperlink r:id="rId50" w:history="1">
+        <w:r>
+          <w:rPr>
+            <w:rStyle w:val="Hyperlink"/>
+          </w:rPr>
+          <w:t>https://developers.google.com/machine-learning/crash-course</w:t>
+        </w:r>
+      </w:hyperlink>
+    </w:p>
+    <w:p>
+      <w:r>
+        <w:t>^for ML best practices</w:t>
+      </w:r>
+    </w:p>
     <w:p/>
-    <w:p>
-      <w:hyperlink r:id="rId69" w:history="1">
+    <w:p/>
+    <w:p>
+      <w:hyperlink r:id="rId51" w:history="1">
         <w:r>
           <w:rPr>
             <w:rStyle w:val="Hyperlink"/>
@@ -4403,7 +4904,7 @@
       </w:hyperlink>
     </w:p>
     <w:p>
-      <w:hyperlink r:id="rId70" w:history="1">
+      <w:hyperlink r:id="rId52" w:history="1">
         <w:r>
           <w:rPr>
             <w:rStyle w:val="Hyperlink"/>
@@ -4413,7 +4914,7 @@
       </w:hyperlink>
     </w:p>
     <w:p>
-      <w:hyperlink r:id="rId71" w:history="1">
+      <w:hyperlink r:id="rId53" w:history="1">
         <w:r>
           <w:rPr>
             <w:rStyle w:val="Hyperlink"/>
@@ -4423,7 +4924,7 @@
       </w:hyperlink>
     </w:p>
     <w:p>
-      <w:hyperlink r:id="rId72" w:history="1">
+      <w:hyperlink r:id="rId54" w:history="1">
         <w:r>
           <w:rPr>
             <w:rStyle w:val="Hyperlink"/>
@@ -4433,7 +4934,7 @@
       </w:hyperlink>
     </w:p>
     <w:p>
-      <w:hyperlink r:id="rId73" w:history="1">
+      <w:hyperlink r:id="rId55" w:history="1">
         <w:r>
           <w:rPr>
             <w:rStyle w:val="Hyperlink"/>
@@ -4443,7 +4944,7 @@
       </w:hyperlink>
     </w:p>
     <w:p>
-      <w:hyperlink r:id="rId74" w:history="1">
+      <w:hyperlink r:id="rId56" w:history="1">
         <w:r>
           <w:rPr>
             <w:rStyle w:val="Hyperlink"/>
@@ -4453,21 +4954,6 @@
       </w:hyperlink>
     </w:p>
     <w:p/>
-    <w:p>
-      <w:hyperlink r:id="rId75" w:history="1">
-        <w:r>
-          <w:rPr>
-            <w:rStyle w:val="Hyperlink"/>
-          </w:rPr>
-          <w:t>https://developers.google.com/machine-learning/crash-course</w:t>
-        </w:r>
-      </w:hyperlink>
-    </w:p>
-    <w:p>
-      <w:r>
-        <w:t>^for ML best practices</w:t>
-      </w:r>
-    </w:p>
     <w:p/>
     <w:sectPr>
       <w:pgSz w:w="12240" w:h="15840"/>

</xml_diff>